<commit_message>
Insertar badges oficiales DUA [ R | A-E | C-M ] en Word y Web modal exactamente como en el formato de ejemplo
</commit_message>
<xml_diff>
--- a/MATRIZ DE PLANIFICACIÓN MICROCURRICULAR 26-27_ACTUALIZADA.docx
+++ b/MATRIZ DE PLANIFICACIÓN MICROCURRICULAR 26-27_ACTUALIZADA.docx
@@ -1621,7 +1621,7 @@
                 <w:b/>
                 <w:sz w:val="18"/>
               </w:rPr>
-              <w:t xml:space="preserve">  • Representación: </w:t>
+              <w:t xml:space="preserve">Representación: </w:t>
             </w:r>
             <w:r>
               <w:rPr>
@@ -1641,7 +1641,7 @@
                 <w:b/>
                 <w:sz w:val="18"/>
               </w:rPr>
-              <w:t xml:space="preserve">  • Acción y expresión: </w:t>
+              <w:t xml:space="preserve">Acción y expresión: </w:t>
             </w:r>
             <w:r>
               <w:rPr>
@@ -1661,7 +1661,7 @@
                 <w:b/>
                 <w:sz w:val="18"/>
               </w:rPr>
-              <w:t xml:space="preserve">  • Compromiso-Motivación: </w:t>
+              <w:t xml:space="preserve">Compromiso-Motivación: </w:t>
             </w:r>
             <w:r>
               <w:rPr>
@@ -1671,6 +1671,111 @@
               <w:t>Desafío de exploración histórica inmersiva con insignias y niveles de arqueólogo.</w:t>
             </w:r>
           </w:p>
+          <w:tbl>
+            <w:tblPr>
+              <w:tblStyle w:val="Tablaconcuadrcula"/>
+              <w:tblW w:w="0" w:type="auto"/>
+              <w:jc w:val="center"/>
+              <w:tblLayout w:type="fixed"/>
+            </w:tblPr>
+            <w:tblGrid>
+              <w:gridCol w:w="683"/>
+              <w:gridCol w:w="683"/>
+              <w:gridCol w:w="683"/>
+            </w:tblGrid>
+            <w:tr>
+              <w:trPr>
+                <w:trHeight w:val="278"/>
+                <w:jc w:val="center"/>
+              </w:trPr>
+              <w:tc>
+                <w:tcPr>
+                  <w:tcW w:w="683" w:type="dxa"/>
+                  <w:shd w:val="clear" w:color="auto" w:fill="7030A0"/>
+                </w:tcPr>
+                <w:p>
+                  <w:pPr>
+                    <w:pStyle w:val="Sinespaciado"/>
+                    <w:jc w:val="center"/>
+                    <w:rPr>
+                      <w:rFonts w:ascii="Times New Roman" w:hAnsi="Times New Roman" w:cs="Times New Roman"/>
+                      <w:b/>
+                      <w:color w:val="FFFFFF"/>
+                      <w:sz w:val="20"/>
+                    </w:rPr>
+                  </w:pPr>
+                  <w:r>
+                    <w:rPr>
+                      <w:rFonts w:ascii="Times New Roman" w:hAnsi="Times New Roman" w:cs="Times New Roman"/>
+                      <w:b/>
+                      <w:color w:val="FFFFFF"/>
+                      <w:sz w:val="20"/>
+                    </w:rPr>
+                    <w:t>R</w:t>
+                  </w:r>
+                </w:p>
+              </w:tc>
+              <w:tc>
+                <w:tcPr>
+                  <w:tcW w:w="683" w:type="dxa"/>
+                  <w:shd w:val="clear" w:color="auto" w:fill="00B0F0"/>
+                </w:tcPr>
+                <w:p>
+                  <w:pPr>
+                    <w:pStyle w:val="Sinespaciado"/>
+                    <w:jc w:val="center"/>
+                    <w:rPr>
+                      <w:rFonts w:ascii="Times New Roman" w:hAnsi="Times New Roman" w:cs="Times New Roman"/>
+                      <w:b/>
+                      <w:color w:val="FFFFFF"/>
+                      <w:sz w:val="20"/>
+                    </w:rPr>
+                  </w:pPr>
+                  <w:r>
+                    <w:rPr>
+                      <w:rFonts w:ascii="Times New Roman" w:hAnsi="Times New Roman" w:cs="Times New Roman"/>
+                      <w:b/>
+                      <w:color w:val="FFFFFF"/>
+                      <w:sz w:val="20"/>
+                    </w:rPr>
+                    <w:t>A-E</w:t>
+                  </w:r>
+                </w:p>
+              </w:tc>
+              <w:tc>
+                <w:tcPr>
+                  <w:tcW w:w="683" w:type="dxa"/>
+                  <w:shd w:val="clear" w:color="auto" w:fill="538135"/>
+                </w:tcPr>
+                <w:p>
+                  <w:pPr>
+                    <w:pStyle w:val="Sinespaciado"/>
+                    <w:jc w:val="center"/>
+                    <w:rPr>
+                      <w:rFonts w:ascii="Times New Roman" w:hAnsi="Times New Roman" w:cs="Times New Roman"/>
+                      <w:b/>
+                      <w:color w:val="FFFFFF"/>
+                      <w:sz w:val="20"/>
+                    </w:rPr>
+                  </w:pPr>
+                  <w:r>
+                    <w:rPr>
+                      <w:rFonts w:ascii="Times New Roman" w:hAnsi="Times New Roman" w:cs="Times New Roman"/>
+                      <w:b/>
+                      <w:color w:val="FFFFFF"/>
+                      <w:sz w:val="20"/>
+                    </w:rPr>
+                    <w:t>C-M</w:t>
+                  </w:r>
+                </w:p>
+              </w:tc>
+            </w:tr>
+          </w:tbl>
+          <w:p>
+            <w:pPr>
+              <w:spacing w:before="40" w:after="40"/>
+            </w:pPr>
+          </w:p>
           <w:p>
             <w:pPr>
               <w:spacing w:before="60" w:after="20"/>
@@ -1739,7 +1844,7 @@
                 <w:b/>
                 <w:sz w:val="18"/>
               </w:rPr>
-              <w:t xml:space="preserve">  • Representación: </w:t>
+              <w:t xml:space="preserve">Representación: </w:t>
             </w:r>
             <w:r>
               <w:rPr>
@@ -1759,7 +1864,7 @@
                 <w:b/>
                 <w:sz w:val="18"/>
               </w:rPr>
-              <w:t xml:space="preserve">  • Acción y expresión: </w:t>
+              <w:t xml:space="preserve">Acción y expresión: </w:t>
             </w:r>
             <w:r>
               <w:rPr>
@@ -1779,7 +1884,7 @@
                 <w:b/>
                 <w:sz w:val="18"/>
               </w:rPr>
-              <w:t xml:space="preserve">  • Compromiso-Motivación: </w:t>
+              <w:t xml:space="preserve">Compromiso-Motivación: </w:t>
             </w:r>
             <w:r>
               <w:rPr>
@@ -1789,6 +1894,111 @@
               <w:t>Trabajo cooperativo en clanes con metas claras y recompensas inmediatas de equipo.</w:t>
             </w:r>
           </w:p>
+          <w:tbl>
+            <w:tblPr>
+              <w:tblStyle w:val="Tablaconcuadrcula"/>
+              <w:tblW w:w="0" w:type="auto"/>
+              <w:jc w:val="center"/>
+              <w:tblLayout w:type="fixed"/>
+            </w:tblPr>
+            <w:tblGrid>
+              <w:gridCol w:w="683"/>
+              <w:gridCol w:w="683"/>
+              <w:gridCol w:w="683"/>
+            </w:tblGrid>
+            <w:tr>
+              <w:trPr>
+                <w:trHeight w:val="278"/>
+                <w:jc w:val="center"/>
+              </w:trPr>
+              <w:tc>
+                <w:tcPr>
+                  <w:tcW w:w="683" w:type="dxa"/>
+                  <w:shd w:val="clear" w:color="auto" w:fill="7030A0"/>
+                </w:tcPr>
+                <w:p>
+                  <w:pPr>
+                    <w:pStyle w:val="Sinespaciado"/>
+                    <w:jc w:val="center"/>
+                    <w:rPr>
+                      <w:rFonts w:ascii="Times New Roman" w:hAnsi="Times New Roman" w:cs="Times New Roman"/>
+                      <w:b/>
+                      <w:color w:val="FFFFFF"/>
+                      <w:sz w:val="20"/>
+                    </w:rPr>
+                  </w:pPr>
+                  <w:r>
+                    <w:rPr>
+                      <w:rFonts w:ascii="Times New Roman" w:hAnsi="Times New Roman" w:cs="Times New Roman"/>
+                      <w:b/>
+                      <w:color w:val="FFFFFF"/>
+                      <w:sz w:val="20"/>
+                    </w:rPr>
+                    <w:t>R</w:t>
+                  </w:r>
+                </w:p>
+              </w:tc>
+              <w:tc>
+                <w:tcPr>
+                  <w:tcW w:w="683" w:type="dxa"/>
+                  <w:shd w:val="clear" w:color="auto" w:fill="00B0F0"/>
+                </w:tcPr>
+                <w:p>
+                  <w:pPr>
+                    <w:pStyle w:val="Sinespaciado"/>
+                    <w:jc w:val="center"/>
+                    <w:rPr>
+                      <w:rFonts w:ascii="Times New Roman" w:hAnsi="Times New Roman" w:cs="Times New Roman"/>
+                      <w:b/>
+                      <w:color w:val="FFFFFF"/>
+                      <w:sz w:val="20"/>
+                    </w:rPr>
+                  </w:pPr>
+                  <w:r>
+                    <w:rPr>
+                      <w:rFonts w:ascii="Times New Roman" w:hAnsi="Times New Roman" w:cs="Times New Roman"/>
+                      <w:b/>
+                      <w:color w:val="FFFFFF"/>
+                      <w:sz w:val="20"/>
+                    </w:rPr>
+                    <w:t>A-E</w:t>
+                  </w:r>
+                </w:p>
+              </w:tc>
+              <w:tc>
+                <w:tcPr>
+                  <w:tcW w:w="683" w:type="dxa"/>
+                  <w:shd w:val="clear" w:color="auto" w:fill="538135"/>
+                </w:tcPr>
+                <w:p>
+                  <w:pPr>
+                    <w:pStyle w:val="Sinespaciado"/>
+                    <w:jc w:val="center"/>
+                    <w:rPr>
+                      <w:rFonts w:ascii="Times New Roman" w:hAnsi="Times New Roman" w:cs="Times New Roman"/>
+                      <w:b/>
+                      <w:color w:val="FFFFFF"/>
+                      <w:sz w:val="20"/>
+                    </w:rPr>
+                  </w:pPr>
+                  <w:r>
+                    <w:rPr>
+                      <w:rFonts w:ascii="Times New Roman" w:hAnsi="Times New Roman" w:cs="Times New Roman"/>
+                      <w:b/>
+                      <w:color w:val="FFFFFF"/>
+                      <w:sz w:val="20"/>
+                    </w:rPr>
+                    <w:t>C-M</w:t>
+                  </w:r>
+                </w:p>
+              </w:tc>
+            </w:tr>
+          </w:tbl>
+          <w:p>
+            <w:pPr>
+              <w:spacing w:before="40" w:after="40"/>
+            </w:pPr>
+          </w:p>
           <w:p>
             <w:pPr>
               <w:spacing w:before="60" w:after="20"/>
@@ -1857,7 +2067,7 @@
                 <w:b/>
                 <w:sz w:val="18"/>
               </w:rPr>
-              <w:t xml:space="preserve">  • Representación: </w:t>
+              <w:t xml:space="preserve">Representación: </w:t>
             </w:r>
             <w:r>
               <w:rPr>
@@ -1877,7 +2087,7 @@
                 <w:b/>
                 <w:sz w:val="18"/>
               </w:rPr>
-              <w:t xml:space="preserve">  • Acción y expresión: </w:t>
+              <w:t xml:space="preserve">Acción y expresión: </w:t>
             </w:r>
             <w:r>
               <w:rPr>
@@ -1897,7 +2107,7 @@
                 <w:b/>
                 <w:sz w:val="18"/>
               </w:rPr>
-              <w:t xml:space="preserve">  • Compromiso-Motivación: </w:t>
+              <w:t xml:space="preserve">Compromiso-Motivación: </w:t>
             </w:r>
             <w:r>
               <w:rPr>
@@ -1907,6 +2117,111 @@
               <w:t>Reto de resolución lógica de acertijos con retroalimentación formativa y lúdica.</w:t>
             </w:r>
           </w:p>
+          <w:tbl>
+            <w:tblPr>
+              <w:tblStyle w:val="Tablaconcuadrcula"/>
+              <w:tblW w:w="0" w:type="auto"/>
+              <w:jc w:val="center"/>
+              <w:tblLayout w:type="fixed"/>
+            </w:tblPr>
+            <w:tblGrid>
+              <w:gridCol w:w="683"/>
+              <w:gridCol w:w="683"/>
+              <w:gridCol w:w="683"/>
+            </w:tblGrid>
+            <w:tr>
+              <w:trPr>
+                <w:trHeight w:val="278"/>
+                <w:jc w:val="center"/>
+              </w:trPr>
+              <w:tc>
+                <w:tcPr>
+                  <w:tcW w:w="683" w:type="dxa"/>
+                  <w:shd w:val="clear" w:color="auto" w:fill="7030A0"/>
+                </w:tcPr>
+                <w:p>
+                  <w:pPr>
+                    <w:pStyle w:val="Sinespaciado"/>
+                    <w:jc w:val="center"/>
+                    <w:rPr>
+                      <w:rFonts w:ascii="Times New Roman" w:hAnsi="Times New Roman" w:cs="Times New Roman"/>
+                      <w:b/>
+                      <w:color w:val="FFFFFF"/>
+                      <w:sz w:val="20"/>
+                    </w:rPr>
+                  </w:pPr>
+                  <w:r>
+                    <w:rPr>
+                      <w:rFonts w:ascii="Times New Roman" w:hAnsi="Times New Roman" w:cs="Times New Roman"/>
+                      <w:b/>
+                      <w:color w:val="FFFFFF"/>
+                      <w:sz w:val="20"/>
+                    </w:rPr>
+                    <w:t>R</w:t>
+                  </w:r>
+                </w:p>
+              </w:tc>
+              <w:tc>
+                <w:tcPr>
+                  <w:tcW w:w="683" w:type="dxa"/>
+                  <w:shd w:val="clear" w:color="auto" w:fill="00B0F0"/>
+                </w:tcPr>
+                <w:p>
+                  <w:pPr>
+                    <w:pStyle w:val="Sinespaciado"/>
+                    <w:jc w:val="center"/>
+                    <w:rPr>
+                      <w:rFonts w:ascii="Times New Roman" w:hAnsi="Times New Roman" w:cs="Times New Roman"/>
+                      <w:b/>
+                      <w:color w:val="FFFFFF"/>
+                      <w:sz w:val="20"/>
+                    </w:rPr>
+                  </w:pPr>
+                  <w:r>
+                    <w:rPr>
+                      <w:rFonts w:ascii="Times New Roman" w:hAnsi="Times New Roman" w:cs="Times New Roman"/>
+                      <w:b/>
+                      <w:color w:val="FFFFFF"/>
+                      <w:sz w:val="20"/>
+                    </w:rPr>
+                    <w:t>A-E</w:t>
+                  </w:r>
+                </w:p>
+              </w:tc>
+              <w:tc>
+                <w:tcPr>
+                  <w:tcW w:w="683" w:type="dxa"/>
+                  <w:shd w:val="clear" w:color="auto" w:fill="538135"/>
+                </w:tcPr>
+                <w:p>
+                  <w:pPr>
+                    <w:pStyle w:val="Sinespaciado"/>
+                    <w:jc w:val="center"/>
+                    <w:rPr>
+                      <w:rFonts w:ascii="Times New Roman" w:hAnsi="Times New Roman" w:cs="Times New Roman"/>
+                      <w:b/>
+                      <w:color w:val="FFFFFF"/>
+                      <w:sz w:val="20"/>
+                    </w:rPr>
+                  </w:pPr>
+                  <w:r>
+                    <w:rPr>
+                      <w:rFonts w:ascii="Times New Roman" w:hAnsi="Times New Roman" w:cs="Times New Roman"/>
+                      <w:b/>
+                      <w:color w:val="FFFFFF"/>
+                      <w:sz w:val="20"/>
+                    </w:rPr>
+                    <w:t>C-M</w:t>
+                  </w:r>
+                </w:p>
+              </w:tc>
+            </w:tr>
+          </w:tbl>
+          <w:p>
+            <w:pPr>
+              <w:spacing w:before="40" w:after="40"/>
+            </w:pPr>
+          </w:p>
           <w:p>
             <w:pPr>
               <w:spacing w:before="60" w:after="20"/>
@@ -1975,7 +2290,7 @@
                 <w:b/>
                 <w:sz w:val="18"/>
               </w:rPr>
-              <w:t xml:space="preserve">  • Representación: </w:t>
+              <w:t xml:space="preserve">Representación: </w:t>
             </w:r>
             <w:r>
               <w:rPr>
@@ -1995,7 +2310,7 @@
                 <w:b/>
                 <w:sz w:val="18"/>
               </w:rPr>
-              <w:t xml:space="preserve">  • Acción y expresión: </w:t>
+              <w:t xml:space="preserve">Acción y expresión: </w:t>
             </w:r>
             <w:r>
               <w:rPr>
@@ -2015,7 +2330,7 @@
                 <w:b/>
                 <w:sz w:val="18"/>
               </w:rPr>
-              <w:t xml:space="preserve">  • Compromiso-Motivación: </w:t>
+              <w:t xml:space="preserve">Compromiso-Motivación: </w:t>
             </w:r>
             <w:r>
               <w:rPr>
@@ -2024,6 +2339,111 @@
               </w:rPr>
               <w:t>Reconocimiento del logro individual dentro de la producción colectiva del aula.</w:t>
             </w:r>
+          </w:p>
+          <w:tbl>
+            <w:tblPr>
+              <w:tblStyle w:val="Tablaconcuadrcula"/>
+              <w:tblW w:w="0" w:type="auto"/>
+              <w:jc w:val="center"/>
+              <w:tblLayout w:type="fixed"/>
+            </w:tblPr>
+            <w:tblGrid>
+              <w:gridCol w:w="683"/>
+              <w:gridCol w:w="683"/>
+              <w:gridCol w:w="683"/>
+            </w:tblGrid>
+            <w:tr>
+              <w:trPr>
+                <w:trHeight w:val="278"/>
+                <w:jc w:val="center"/>
+              </w:trPr>
+              <w:tc>
+                <w:tcPr>
+                  <w:tcW w:w="683" w:type="dxa"/>
+                  <w:shd w:val="clear" w:color="auto" w:fill="7030A0"/>
+                </w:tcPr>
+                <w:p>
+                  <w:pPr>
+                    <w:pStyle w:val="Sinespaciado"/>
+                    <w:jc w:val="center"/>
+                    <w:rPr>
+                      <w:rFonts w:ascii="Times New Roman" w:hAnsi="Times New Roman" w:cs="Times New Roman"/>
+                      <w:b/>
+                      <w:color w:val="FFFFFF"/>
+                      <w:sz w:val="20"/>
+                    </w:rPr>
+                  </w:pPr>
+                  <w:r>
+                    <w:rPr>
+                      <w:rFonts w:ascii="Times New Roman" w:hAnsi="Times New Roman" w:cs="Times New Roman"/>
+                      <w:b/>
+                      <w:color w:val="FFFFFF"/>
+                      <w:sz w:val="20"/>
+                    </w:rPr>
+                    <w:t>R</w:t>
+                  </w:r>
+                </w:p>
+              </w:tc>
+              <w:tc>
+                <w:tcPr>
+                  <w:tcW w:w="683" w:type="dxa"/>
+                  <w:shd w:val="clear" w:color="auto" w:fill="00B0F0"/>
+                </w:tcPr>
+                <w:p>
+                  <w:pPr>
+                    <w:pStyle w:val="Sinespaciado"/>
+                    <w:jc w:val="center"/>
+                    <w:rPr>
+                      <w:rFonts w:ascii="Times New Roman" w:hAnsi="Times New Roman" w:cs="Times New Roman"/>
+                      <w:b/>
+                      <w:color w:val="FFFFFF"/>
+                      <w:sz w:val="20"/>
+                    </w:rPr>
+                  </w:pPr>
+                  <w:r>
+                    <w:rPr>
+                      <w:rFonts w:ascii="Times New Roman" w:hAnsi="Times New Roman" w:cs="Times New Roman"/>
+                      <w:b/>
+                      <w:color w:val="FFFFFF"/>
+                      <w:sz w:val="20"/>
+                    </w:rPr>
+                    <w:t>A-E</w:t>
+                  </w:r>
+                </w:p>
+              </w:tc>
+              <w:tc>
+                <w:tcPr>
+                  <w:tcW w:w="683" w:type="dxa"/>
+                  <w:shd w:val="clear" w:color="auto" w:fill="538135"/>
+                </w:tcPr>
+                <w:p>
+                  <w:pPr>
+                    <w:pStyle w:val="Sinespaciado"/>
+                    <w:jc w:val="center"/>
+                    <w:rPr>
+                      <w:rFonts w:ascii="Times New Roman" w:hAnsi="Times New Roman" w:cs="Times New Roman"/>
+                      <w:b/>
+                      <w:color w:val="FFFFFF"/>
+                      <w:sz w:val="20"/>
+                    </w:rPr>
+                  </w:pPr>
+                  <w:r>
+                    <w:rPr>
+                      <w:rFonts w:ascii="Times New Roman" w:hAnsi="Times New Roman" w:cs="Times New Roman"/>
+                      <w:b/>
+                      <w:color w:val="FFFFFF"/>
+                      <w:sz w:val="20"/>
+                    </w:rPr>
+                    <w:t>C-M</w:t>
+                  </w:r>
+                </w:p>
+              </w:tc>
+            </w:tr>
+          </w:tbl>
+          <w:p>
+            <w:pPr>
+              <w:spacing w:before="40" w:after="40"/>
+            </w:pPr>
           </w:p>
         </w:tc>
         <w:tc>
@@ -2215,7 +2635,7 @@
                 <w:b/>
                 <w:sz w:val="18"/>
               </w:rPr>
-              <w:t xml:space="preserve">  • Representación: </w:t>
+              <w:t xml:space="preserve">Representación: </w:t>
             </w:r>
             <w:r>
               <w:rPr>
@@ -2235,7 +2655,7 @@
                 <w:b/>
                 <w:sz w:val="18"/>
               </w:rPr>
-              <w:t xml:space="preserve">  • Acción y expresión: </w:t>
+              <w:t xml:space="preserve">Acción y expresión: </w:t>
             </w:r>
             <w:r>
               <w:rPr>
@@ -2255,7 +2675,7 @@
                 <w:b/>
                 <w:sz w:val="18"/>
               </w:rPr>
-              <w:t xml:space="preserve">  • Compromiso-Motivación: </w:t>
+              <w:t xml:space="preserve">Compromiso-Motivación: </w:t>
             </w:r>
             <w:r>
               <w:rPr>
@@ -2265,6 +2685,111 @@
               <w:t>Identificación con emociones reales y superación guiada del miedo escénico.</w:t>
             </w:r>
           </w:p>
+          <w:tbl>
+            <w:tblPr>
+              <w:tblStyle w:val="Tablaconcuadrcula"/>
+              <w:tblW w:w="0" w:type="auto"/>
+              <w:jc w:val="center"/>
+              <w:tblLayout w:type="fixed"/>
+            </w:tblPr>
+            <w:tblGrid>
+              <w:gridCol w:w="683"/>
+              <w:gridCol w:w="683"/>
+              <w:gridCol w:w="683"/>
+            </w:tblGrid>
+            <w:tr>
+              <w:trPr>
+                <w:trHeight w:val="278"/>
+                <w:jc w:val="center"/>
+              </w:trPr>
+              <w:tc>
+                <w:tcPr>
+                  <w:tcW w:w="683" w:type="dxa"/>
+                  <w:shd w:val="clear" w:color="auto" w:fill="7030A0"/>
+                </w:tcPr>
+                <w:p>
+                  <w:pPr>
+                    <w:pStyle w:val="Sinespaciado"/>
+                    <w:jc w:val="center"/>
+                    <w:rPr>
+                      <w:rFonts w:ascii="Times New Roman" w:hAnsi="Times New Roman" w:cs="Times New Roman"/>
+                      <w:b/>
+                      <w:color w:val="FFFFFF"/>
+                      <w:sz w:val="20"/>
+                    </w:rPr>
+                  </w:pPr>
+                  <w:r>
+                    <w:rPr>
+                      <w:rFonts w:ascii="Times New Roman" w:hAnsi="Times New Roman" w:cs="Times New Roman"/>
+                      <w:b/>
+                      <w:color w:val="FFFFFF"/>
+                      <w:sz w:val="20"/>
+                    </w:rPr>
+                    <w:t>R</w:t>
+                  </w:r>
+                </w:p>
+              </w:tc>
+              <w:tc>
+                <w:tcPr>
+                  <w:tcW w:w="683" w:type="dxa"/>
+                  <w:shd w:val="clear" w:color="auto" w:fill="00B0F0"/>
+                </w:tcPr>
+                <w:p>
+                  <w:pPr>
+                    <w:pStyle w:val="Sinespaciado"/>
+                    <w:jc w:val="center"/>
+                    <w:rPr>
+                      <w:rFonts w:ascii="Times New Roman" w:hAnsi="Times New Roman" w:cs="Times New Roman"/>
+                      <w:b/>
+                      <w:color w:val="FFFFFF"/>
+                      <w:sz w:val="20"/>
+                    </w:rPr>
+                  </w:pPr>
+                  <w:r>
+                    <w:rPr>
+                      <w:rFonts w:ascii="Times New Roman" w:hAnsi="Times New Roman" w:cs="Times New Roman"/>
+                      <w:b/>
+                      <w:color w:val="FFFFFF"/>
+                      <w:sz w:val="20"/>
+                    </w:rPr>
+                    <w:t>A-E</w:t>
+                  </w:r>
+                </w:p>
+              </w:tc>
+              <w:tc>
+                <w:tcPr>
+                  <w:tcW w:w="683" w:type="dxa"/>
+                  <w:shd w:val="clear" w:color="auto" w:fill="538135"/>
+                </w:tcPr>
+                <w:p>
+                  <w:pPr>
+                    <w:pStyle w:val="Sinespaciado"/>
+                    <w:jc w:val="center"/>
+                    <w:rPr>
+                      <w:rFonts w:ascii="Times New Roman" w:hAnsi="Times New Roman" w:cs="Times New Roman"/>
+                      <w:b/>
+                      <w:color w:val="FFFFFF"/>
+                      <w:sz w:val="20"/>
+                    </w:rPr>
+                  </w:pPr>
+                  <w:r>
+                    <w:rPr>
+                      <w:rFonts w:ascii="Times New Roman" w:hAnsi="Times New Roman" w:cs="Times New Roman"/>
+                      <w:b/>
+                      <w:color w:val="FFFFFF"/>
+                      <w:sz w:val="20"/>
+                    </w:rPr>
+                    <w:t>C-M</w:t>
+                  </w:r>
+                </w:p>
+              </w:tc>
+            </w:tr>
+          </w:tbl>
+          <w:p>
+            <w:pPr>
+              <w:spacing w:before="40" w:after="40"/>
+            </w:pPr>
+          </w:p>
           <w:p>
             <w:pPr>
               <w:spacing w:before="60" w:after="20"/>
@@ -2333,7 +2858,7 @@
                 <w:b/>
                 <w:sz w:val="18"/>
               </w:rPr>
-              <w:t xml:space="preserve">  • Representación: </w:t>
+              <w:t xml:space="preserve">Representación: </w:t>
             </w:r>
             <w:r>
               <w:rPr>
@@ -2353,7 +2878,7 @@
                 <w:b/>
                 <w:sz w:val="18"/>
               </w:rPr>
-              <w:t xml:space="preserve">  • Acción y expresión: </w:t>
+              <w:t xml:space="preserve">Acción y expresión: </w:t>
             </w:r>
             <w:r>
               <w:rPr>
@@ -2373,7 +2898,7 @@
                 <w:b/>
                 <w:sz w:val="18"/>
               </w:rPr>
-              <w:t xml:space="preserve">  • Compromiso-Motivación: </w:t>
+              <w:t xml:space="preserve">Compromiso-Motivación: </w:t>
             </w:r>
             <w:r>
               <w:rPr>
@@ -2383,6 +2908,111 @@
               <w:t>Aprendizaje activo y deductivo mediante el análisis de discursos reales.</w:t>
             </w:r>
           </w:p>
+          <w:tbl>
+            <w:tblPr>
+              <w:tblStyle w:val="Tablaconcuadrcula"/>
+              <w:tblW w:w="0" w:type="auto"/>
+              <w:jc w:val="center"/>
+              <w:tblLayout w:type="fixed"/>
+            </w:tblPr>
+            <w:tblGrid>
+              <w:gridCol w:w="683"/>
+              <w:gridCol w:w="683"/>
+              <w:gridCol w:w="683"/>
+            </w:tblGrid>
+            <w:tr>
+              <w:trPr>
+                <w:trHeight w:val="278"/>
+                <w:jc w:val="center"/>
+              </w:trPr>
+              <w:tc>
+                <w:tcPr>
+                  <w:tcW w:w="683" w:type="dxa"/>
+                  <w:shd w:val="clear" w:color="auto" w:fill="7030A0"/>
+                </w:tcPr>
+                <w:p>
+                  <w:pPr>
+                    <w:pStyle w:val="Sinespaciado"/>
+                    <w:jc w:val="center"/>
+                    <w:rPr>
+                      <w:rFonts w:ascii="Times New Roman" w:hAnsi="Times New Roman" w:cs="Times New Roman"/>
+                      <w:b/>
+                      <w:color w:val="FFFFFF"/>
+                      <w:sz w:val="20"/>
+                    </w:rPr>
+                  </w:pPr>
+                  <w:r>
+                    <w:rPr>
+                      <w:rFonts w:ascii="Times New Roman" w:hAnsi="Times New Roman" w:cs="Times New Roman"/>
+                      <w:b/>
+                      <w:color w:val="FFFFFF"/>
+                      <w:sz w:val="20"/>
+                    </w:rPr>
+                    <w:t>R</w:t>
+                  </w:r>
+                </w:p>
+              </w:tc>
+              <w:tc>
+                <w:tcPr>
+                  <w:tcW w:w="683" w:type="dxa"/>
+                  <w:shd w:val="clear" w:color="auto" w:fill="00B0F0"/>
+                </w:tcPr>
+                <w:p>
+                  <w:pPr>
+                    <w:pStyle w:val="Sinespaciado"/>
+                    <w:jc w:val="center"/>
+                    <w:rPr>
+                      <w:rFonts w:ascii="Times New Roman" w:hAnsi="Times New Roman" w:cs="Times New Roman"/>
+                      <w:b/>
+                      <w:color w:val="FFFFFF"/>
+                      <w:sz w:val="20"/>
+                    </w:rPr>
+                  </w:pPr>
+                  <w:r>
+                    <w:rPr>
+                      <w:rFonts w:ascii="Times New Roman" w:hAnsi="Times New Roman" w:cs="Times New Roman"/>
+                      <w:b/>
+                      <w:color w:val="FFFFFF"/>
+                      <w:sz w:val="20"/>
+                    </w:rPr>
+                    <w:t>A-E</w:t>
+                  </w:r>
+                </w:p>
+              </w:tc>
+              <w:tc>
+                <w:tcPr>
+                  <w:tcW w:w="683" w:type="dxa"/>
+                  <w:shd w:val="clear" w:color="auto" w:fill="538135"/>
+                </w:tcPr>
+                <w:p>
+                  <w:pPr>
+                    <w:pStyle w:val="Sinespaciado"/>
+                    <w:jc w:val="center"/>
+                    <w:rPr>
+                      <w:rFonts w:ascii="Times New Roman" w:hAnsi="Times New Roman" w:cs="Times New Roman"/>
+                      <w:b/>
+                      <w:color w:val="FFFFFF"/>
+                      <w:sz w:val="20"/>
+                    </w:rPr>
+                  </w:pPr>
+                  <w:r>
+                    <w:rPr>
+                      <w:rFonts w:ascii="Times New Roman" w:hAnsi="Times New Roman" w:cs="Times New Roman"/>
+                      <w:b/>
+                      <w:color w:val="FFFFFF"/>
+                      <w:sz w:val="20"/>
+                    </w:rPr>
+                    <w:t>C-M</w:t>
+                  </w:r>
+                </w:p>
+              </w:tc>
+            </w:tr>
+          </w:tbl>
+          <w:p>
+            <w:pPr>
+              <w:spacing w:before="40" w:after="40"/>
+            </w:pPr>
+          </w:p>
           <w:p>
             <w:pPr>
               <w:spacing w:before="60" w:after="20"/>
@@ -2451,7 +3081,7 @@
                 <w:b/>
                 <w:sz w:val="18"/>
               </w:rPr>
-              <w:t xml:space="preserve">  • Representación: </w:t>
+              <w:t xml:space="preserve">Representación: </w:t>
             </w:r>
             <w:r>
               <w:rPr>
@@ -2471,7 +3101,7 @@
                 <w:b/>
                 <w:sz w:val="18"/>
               </w:rPr>
-              <w:t xml:space="preserve">  • Acción y expresión: </w:t>
+              <w:t xml:space="preserve">Acción y expresión: </w:t>
             </w:r>
             <w:r>
               <w:rPr>
@@ -2491,7 +3121,7 @@
                 <w:b/>
                 <w:sz w:val="18"/>
               </w:rPr>
-              <w:t xml:space="preserve">  • Compromiso-Motivación: </w:t>
+              <w:t xml:space="preserve">Compromiso-Motivación: </w:t>
             </w:r>
             <w:r>
               <w:rPr>
@@ -2501,6 +3131,111 @@
               <w:t>Empoderamiento de la voz del estudiante en un ambiente de respeto mutuo.</w:t>
             </w:r>
           </w:p>
+          <w:tbl>
+            <w:tblPr>
+              <w:tblStyle w:val="Tablaconcuadrcula"/>
+              <w:tblW w:w="0" w:type="auto"/>
+              <w:jc w:val="center"/>
+              <w:tblLayout w:type="fixed"/>
+            </w:tblPr>
+            <w:tblGrid>
+              <w:gridCol w:w="683"/>
+              <w:gridCol w:w="683"/>
+              <w:gridCol w:w="683"/>
+            </w:tblGrid>
+            <w:tr>
+              <w:trPr>
+                <w:trHeight w:val="278"/>
+                <w:jc w:val="center"/>
+              </w:trPr>
+              <w:tc>
+                <w:tcPr>
+                  <w:tcW w:w="683" w:type="dxa"/>
+                  <w:shd w:val="clear" w:color="auto" w:fill="7030A0"/>
+                </w:tcPr>
+                <w:p>
+                  <w:pPr>
+                    <w:pStyle w:val="Sinespaciado"/>
+                    <w:jc w:val="center"/>
+                    <w:rPr>
+                      <w:rFonts w:ascii="Times New Roman" w:hAnsi="Times New Roman" w:cs="Times New Roman"/>
+                      <w:b/>
+                      <w:color w:val="FFFFFF"/>
+                      <w:sz w:val="20"/>
+                    </w:rPr>
+                  </w:pPr>
+                  <w:r>
+                    <w:rPr>
+                      <w:rFonts w:ascii="Times New Roman" w:hAnsi="Times New Roman" w:cs="Times New Roman"/>
+                      <w:b/>
+                      <w:color w:val="FFFFFF"/>
+                      <w:sz w:val="20"/>
+                    </w:rPr>
+                    <w:t>R</w:t>
+                  </w:r>
+                </w:p>
+              </w:tc>
+              <w:tc>
+                <w:tcPr>
+                  <w:tcW w:w="683" w:type="dxa"/>
+                  <w:shd w:val="clear" w:color="auto" w:fill="00B0F0"/>
+                </w:tcPr>
+                <w:p>
+                  <w:pPr>
+                    <w:pStyle w:val="Sinespaciado"/>
+                    <w:jc w:val="center"/>
+                    <w:rPr>
+                      <w:rFonts w:ascii="Times New Roman" w:hAnsi="Times New Roman" w:cs="Times New Roman"/>
+                      <w:b/>
+                      <w:color w:val="FFFFFF"/>
+                      <w:sz w:val="20"/>
+                    </w:rPr>
+                  </w:pPr>
+                  <w:r>
+                    <w:rPr>
+                      <w:rFonts w:ascii="Times New Roman" w:hAnsi="Times New Roman" w:cs="Times New Roman"/>
+                      <w:b/>
+                      <w:color w:val="FFFFFF"/>
+                      <w:sz w:val="20"/>
+                    </w:rPr>
+                    <w:t>A-E</w:t>
+                  </w:r>
+                </w:p>
+              </w:tc>
+              <w:tc>
+                <w:tcPr>
+                  <w:tcW w:w="683" w:type="dxa"/>
+                  <w:shd w:val="clear" w:color="auto" w:fill="538135"/>
+                </w:tcPr>
+                <w:p>
+                  <w:pPr>
+                    <w:pStyle w:val="Sinespaciado"/>
+                    <w:jc w:val="center"/>
+                    <w:rPr>
+                      <w:rFonts w:ascii="Times New Roman" w:hAnsi="Times New Roman" w:cs="Times New Roman"/>
+                      <w:b/>
+                      <w:color w:val="FFFFFF"/>
+                      <w:sz w:val="20"/>
+                    </w:rPr>
+                  </w:pPr>
+                  <w:r>
+                    <w:rPr>
+                      <w:rFonts w:ascii="Times New Roman" w:hAnsi="Times New Roman" w:cs="Times New Roman"/>
+                      <w:b/>
+                      <w:color w:val="FFFFFF"/>
+                      <w:sz w:val="20"/>
+                    </w:rPr>
+                    <w:t>C-M</w:t>
+                  </w:r>
+                </w:p>
+              </w:tc>
+            </w:tr>
+          </w:tbl>
+          <w:p>
+            <w:pPr>
+              <w:spacing w:before="40" w:after="40"/>
+            </w:pPr>
+          </w:p>
           <w:p>
             <w:pPr>
               <w:spacing w:before="60" w:after="20"/>
@@ -2569,7 +3304,7 @@
                 <w:b/>
                 <w:sz w:val="18"/>
               </w:rPr>
-              <w:t xml:space="preserve">  • Representación: </w:t>
+              <w:t xml:space="preserve">Representación: </w:t>
             </w:r>
             <w:r>
               <w:rPr>
@@ -2589,7 +3324,7 @@
                 <w:b/>
                 <w:sz w:val="18"/>
               </w:rPr>
-              <w:t xml:space="preserve">  • Acción y expresión: </w:t>
+              <w:t xml:space="preserve">Acción y expresión: </w:t>
             </w:r>
             <w:r>
               <w:rPr>
@@ -2609,7 +3344,7 @@
                 <w:b/>
                 <w:sz w:val="18"/>
               </w:rPr>
-              <w:t xml:space="preserve">  • Compromiso-Motivación: </w:t>
+              <w:t xml:space="preserve">Compromiso-Motivación: </w:t>
             </w:r>
             <w:r>
               <w:rPr>
@@ -2618,6 +3353,111 @@
               </w:rPr>
               <w:t>Celebración del crecimiento comunicativo grupal.</w:t>
             </w:r>
+          </w:p>
+          <w:tbl>
+            <w:tblPr>
+              <w:tblStyle w:val="Tablaconcuadrcula"/>
+              <w:tblW w:w="0" w:type="auto"/>
+              <w:jc w:val="center"/>
+              <w:tblLayout w:type="fixed"/>
+            </w:tblPr>
+            <w:tblGrid>
+              <w:gridCol w:w="683"/>
+              <w:gridCol w:w="683"/>
+              <w:gridCol w:w="683"/>
+            </w:tblGrid>
+            <w:tr>
+              <w:trPr>
+                <w:trHeight w:val="278"/>
+                <w:jc w:val="center"/>
+              </w:trPr>
+              <w:tc>
+                <w:tcPr>
+                  <w:tcW w:w="683" w:type="dxa"/>
+                  <w:shd w:val="clear" w:color="auto" w:fill="7030A0"/>
+                </w:tcPr>
+                <w:p>
+                  <w:pPr>
+                    <w:pStyle w:val="Sinespaciado"/>
+                    <w:jc w:val="center"/>
+                    <w:rPr>
+                      <w:rFonts w:ascii="Times New Roman" w:hAnsi="Times New Roman" w:cs="Times New Roman"/>
+                      <w:b/>
+                      <w:color w:val="FFFFFF"/>
+                      <w:sz w:val="20"/>
+                    </w:rPr>
+                  </w:pPr>
+                  <w:r>
+                    <w:rPr>
+                      <w:rFonts w:ascii="Times New Roman" w:hAnsi="Times New Roman" w:cs="Times New Roman"/>
+                      <w:b/>
+                      <w:color w:val="FFFFFF"/>
+                      <w:sz w:val="20"/>
+                    </w:rPr>
+                    <w:t>R</w:t>
+                  </w:r>
+                </w:p>
+              </w:tc>
+              <w:tc>
+                <w:tcPr>
+                  <w:tcW w:w="683" w:type="dxa"/>
+                  <w:shd w:val="clear" w:color="auto" w:fill="00B0F0"/>
+                </w:tcPr>
+                <w:p>
+                  <w:pPr>
+                    <w:pStyle w:val="Sinespaciado"/>
+                    <w:jc w:val="center"/>
+                    <w:rPr>
+                      <w:rFonts w:ascii="Times New Roman" w:hAnsi="Times New Roman" w:cs="Times New Roman"/>
+                      <w:b/>
+                      <w:color w:val="FFFFFF"/>
+                      <w:sz w:val="20"/>
+                    </w:rPr>
+                  </w:pPr>
+                  <w:r>
+                    <w:rPr>
+                      <w:rFonts w:ascii="Times New Roman" w:hAnsi="Times New Roman" w:cs="Times New Roman"/>
+                      <w:b/>
+                      <w:color w:val="FFFFFF"/>
+                      <w:sz w:val="20"/>
+                    </w:rPr>
+                    <w:t>A-E</w:t>
+                  </w:r>
+                </w:p>
+              </w:tc>
+              <w:tc>
+                <w:tcPr>
+                  <w:tcW w:w="683" w:type="dxa"/>
+                  <w:shd w:val="clear" w:color="auto" w:fill="538135"/>
+                </w:tcPr>
+                <w:p>
+                  <w:pPr>
+                    <w:pStyle w:val="Sinespaciado"/>
+                    <w:jc w:val="center"/>
+                    <w:rPr>
+                      <w:rFonts w:ascii="Times New Roman" w:hAnsi="Times New Roman" w:cs="Times New Roman"/>
+                      <w:b/>
+                      <w:color w:val="FFFFFF"/>
+                      <w:sz w:val="20"/>
+                    </w:rPr>
+                  </w:pPr>
+                  <w:r>
+                    <w:rPr>
+                      <w:rFonts w:ascii="Times New Roman" w:hAnsi="Times New Roman" w:cs="Times New Roman"/>
+                      <w:b/>
+                      <w:color w:val="FFFFFF"/>
+                      <w:sz w:val="20"/>
+                    </w:rPr>
+                    <w:t>C-M</w:t>
+                  </w:r>
+                </w:p>
+              </w:tc>
+            </w:tr>
+          </w:tbl>
+          <w:p>
+            <w:pPr>
+              <w:spacing w:before="40" w:after="40"/>
+            </w:pPr>
           </w:p>
         </w:tc>
         <w:tc>
@@ -2812,7 +3652,7 @@
                 <w:b/>
                 <w:sz w:val="18"/>
               </w:rPr>
-              <w:t xml:space="preserve">  • Representación: </w:t>
+              <w:t xml:space="preserve">Representación: </w:t>
             </w:r>
             <w:r>
               <w:rPr>
@@ -2832,7 +3672,7 @@
                 <w:b/>
                 <w:sz w:val="18"/>
               </w:rPr>
-              <w:t xml:space="preserve">  • Acción y expresión: </w:t>
+              <w:t xml:space="preserve">Acción y expresión: </w:t>
             </w:r>
             <w:r>
               <w:rPr>
@@ -2852,7 +3692,7 @@
                 <w:b/>
                 <w:sz w:val="18"/>
               </w:rPr>
-              <w:t xml:space="preserve">  • Compromiso-Motivación: </w:t>
+              <w:t xml:space="preserve">Compromiso-Motivación: </w:t>
             </w:r>
             <w:r>
               <w:rPr>
@@ -2862,6 +3702,111 @@
               <w:t>Despertar del espíritu crítico frente a la información digital.</w:t>
             </w:r>
           </w:p>
+          <w:tbl>
+            <w:tblPr>
+              <w:tblStyle w:val="Tablaconcuadrcula"/>
+              <w:tblW w:w="0" w:type="auto"/>
+              <w:jc w:val="center"/>
+              <w:tblLayout w:type="fixed"/>
+            </w:tblPr>
+            <w:tblGrid>
+              <w:gridCol w:w="683"/>
+              <w:gridCol w:w="683"/>
+              <w:gridCol w:w="683"/>
+            </w:tblGrid>
+            <w:tr>
+              <w:trPr>
+                <w:trHeight w:val="278"/>
+                <w:jc w:val="center"/>
+              </w:trPr>
+              <w:tc>
+                <w:tcPr>
+                  <w:tcW w:w="683" w:type="dxa"/>
+                  <w:shd w:val="clear" w:color="auto" w:fill="7030A0"/>
+                </w:tcPr>
+                <w:p>
+                  <w:pPr>
+                    <w:pStyle w:val="Sinespaciado"/>
+                    <w:jc w:val="center"/>
+                    <w:rPr>
+                      <w:rFonts w:ascii="Times New Roman" w:hAnsi="Times New Roman" w:cs="Times New Roman"/>
+                      <w:b/>
+                      <w:color w:val="FFFFFF"/>
+                      <w:sz w:val="20"/>
+                    </w:rPr>
+                  </w:pPr>
+                  <w:r>
+                    <w:rPr>
+                      <w:rFonts w:ascii="Times New Roman" w:hAnsi="Times New Roman" w:cs="Times New Roman"/>
+                      <w:b/>
+                      <w:color w:val="FFFFFF"/>
+                      <w:sz w:val="20"/>
+                    </w:rPr>
+                    <w:t>R</w:t>
+                  </w:r>
+                </w:p>
+              </w:tc>
+              <w:tc>
+                <w:tcPr>
+                  <w:tcW w:w="683" w:type="dxa"/>
+                  <w:shd w:val="clear" w:color="auto" w:fill="00B0F0"/>
+                </w:tcPr>
+                <w:p>
+                  <w:pPr>
+                    <w:pStyle w:val="Sinespaciado"/>
+                    <w:jc w:val="center"/>
+                    <w:rPr>
+                      <w:rFonts w:ascii="Times New Roman" w:hAnsi="Times New Roman" w:cs="Times New Roman"/>
+                      <w:b/>
+                      <w:color w:val="FFFFFF"/>
+                      <w:sz w:val="20"/>
+                    </w:rPr>
+                  </w:pPr>
+                  <w:r>
+                    <w:rPr>
+                      <w:rFonts w:ascii="Times New Roman" w:hAnsi="Times New Roman" w:cs="Times New Roman"/>
+                      <w:b/>
+                      <w:color w:val="FFFFFF"/>
+                      <w:sz w:val="20"/>
+                    </w:rPr>
+                    <w:t>A-E</w:t>
+                  </w:r>
+                </w:p>
+              </w:tc>
+              <w:tc>
+                <w:tcPr>
+                  <w:tcW w:w="683" w:type="dxa"/>
+                  <w:shd w:val="clear" w:color="auto" w:fill="538135"/>
+                </w:tcPr>
+                <w:p>
+                  <w:pPr>
+                    <w:pStyle w:val="Sinespaciado"/>
+                    <w:jc w:val="center"/>
+                    <w:rPr>
+                      <w:rFonts w:ascii="Times New Roman" w:hAnsi="Times New Roman" w:cs="Times New Roman"/>
+                      <w:b/>
+                      <w:color w:val="FFFFFF"/>
+                      <w:sz w:val="20"/>
+                    </w:rPr>
+                  </w:pPr>
+                  <w:r>
+                    <w:rPr>
+                      <w:rFonts w:ascii="Times New Roman" w:hAnsi="Times New Roman" w:cs="Times New Roman"/>
+                      <w:b/>
+                      <w:color w:val="FFFFFF"/>
+                      <w:sz w:val="20"/>
+                    </w:rPr>
+                    <w:t>C-M</w:t>
+                  </w:r>
+                </w:p>
+              </w:tc>
+            </w:tr>
+          </w:tbl>
+          <w:p>
+            <w:pPr>
+              <w:spacing w:before="40" w:after="40"/>
+            </w:pPr>
+          </w:p>
           <w:p>
             <w:pPr>
               <w:spacing w:before="60" w:after="20"/>
@@ -2930,7 +3875,7 @@
                 <w:b/>
                 <w:sz w:val="18"/>
               </w:rPr>
-              <w:t xml:space="preserve">  • Representación: </w:t>
+              <w:t xml:space="preserve">Representación: </w:t>
             </w:r>
             <w:r>
               <w:rPr>
@@ -2950,7 +3895,7 @@
                 <w:b/>
                 <w:sz w:val="18"/>
               </w:rPr>
-              <w:t xml:space="preserve">  • Acción y expresión: </w:t>
+              <w:t xml:space="preserve">Acción y expresión: </w:t>
             </w:r>
             <w:r>
               <w:rPr>
@@ -2970,7 +3915,7 @@
                 <w:b/>
                 <w:sz w:val="18"/>
               </w:rPr>
-              <w:t xml:space="preserve">  • Compromiso-Motivación: </w:t>
+              <w:t xml:space="preserve">Compromiso-Motivación: </w:t>
             </w:r>
             <w:r>
               <w:rPr>
@@ -2980,6 +3925,111 @@
               <w:t>Familiarización con la biblioteca como espacio de investigación autónoma.</w:t>
             </w:r>
           </w:p>
+          <w:tbl>
+            <w:tblPr>
+              <w:tblStyle w:val="Tablaconcuadrcula"/>
+              <w:tblW w:w="0" w:type="auto"/>
+              <w:jc w:val="center"/>
+              <w:tblLayout w:type="fixed"/>
+            </w:tblPr>
+            <w:tblGrid>
+              <w:gridCol w:w="683"/>
+              <w:gridCol w:w="683"/>
+              <w:gridCol w:w="683"/>
+            </w:tblGrid>
+            <w:tr>
+              <w:trPr>
+                <w:trHeight w:val="278"/>
+                <w:jc w:val="center"/>
+              </w:trPr>
+              <w:tc>
+                <w:tcPr>
+                  <w:tcW w:w="683" w:type="dxa"/>
+                  <w:shd w:val="clear" w:color="auto" w:fill="7030A0"/>
+                </w:tcPr>
+                <w:p>
+                  <w:pPr>
+                    <w:pStyle w:val="Sinespaciado"/>
+                    <w:jc w:val="center"/>
+                    <w:rPr>
+                      <w:rFonts w:ascii="Times New Roman" w:hAnsi="Times New Roman" w:cs="Times New Roman"/>
+                      <w:b/>
+                      <w:color w:val="FFFFFF"/>
+                      <w:sz w:val="20"/>
+                    </w:rPr>
+                  </w:pPr>
+                  <w:r>
+                    <w:rPr>
+                      <w:rFonts w:ascii="Times New Roman" w:hAnsi="Times New Roman" w:cs="Times New Roman"/>
+                      <w:b/>
+                      <w:color w:val="FFFFFF"/>
+                      <w:sz w:val="20"/>
+                    </w:rPr>
+                    <w:t>R</w:t>
+                  </w:r>
+                </w:p>
+              </w:tc>
+              <w:tc>
+                <w:tcPr>
+                  <w:tcW w:w="683" w:type="dxa"/>
+                  <w:shd w:val="clear" w:color="auto" w:fill="00B0F0"/>
+                </w:tcPr>
+                <w:p>
+                  <w:pPr>
+                    <w:pStyle w:val="Sinespaciado"/>
+                    <w:jc w:val="center"/>
+                    <w:rPr>
+                      <w:rFonts w:ascii="Times New Roman" w:hAnsi="Times New Roman" w:cs="Times New Roman"/>
+                      <w:b/>
+                      <w:color w:val="FFFFFF"/>
+                      <w:sz w:val="20"/>
+                    </w:rPr>
+                  </w:pPr>
+                  <w:r>
+                    <w:rPr>
+                      <w:rFonts w:ascii="Times New Roman" w:hAnsi="Times New Roman" w:cs="Times New Roman"/>
+                      <w:b/>
+                      <w:color w:val="FFFFFF"/>
+                      <w:sz w:val="20"/>
+                    </w:rPr>
+                    <w:t>A-E</w:t>
+                  </w:r>
+                </w:p>
+              </w:tc>
+              <w:tc>
+                <w:tcPr>
+                  <w:tcW w:w="683" w:type="dxa"/>
+                  <w:shd w:val="clear" w:color="auto" w:fill="538135"/>
+                </w:tcPr>
+                <w:p>
+                  <w:pPr>
+                    <w:pStyle w:val="Sinespaciado"/>
+                    <w:jc w:val="center"/>
+                    <w:rPr>
+                      <w:rFonts w:ascii="Times New Roman" w:hAnsi="Times New Roman" w:cs="Times New Roman"/>
+                      <w:b/>
+                      <w:color w:val="FFFFFF"/>
+                      <w:sz w:val="20"/>
+                    </w:rPr>
+                  </w:pPr>
+                  <w:r>
+                    <w:rPr>
+                      <w:rFonts w:ascii="Times New Roman" w:hAnsi="Times New Roman" w:cs="Times New Roman"/>
+                      <w:b/>
+                      <w:color w:val="FFFFFF"/>
+                      <w:sz w:val="20"/>
+                    </w:rPr>
+                    <w:t>C-M</w:t>
+                  </w:r>
+                </w:p>
+              </w:tc>
+            </w:tr>
+          </w:tbl>
+          <w:p>
+            <w:pPr>
+              <w:spacing w:before="40" w:after="40"/>
+            </w:pPr>
+          </w:p>
           <w:p>
             <w:pPr>
               <w:spacing w:before="60" w:after="20"/>
@@ -3048,7 +4098,7 @@
                 <w:b/>
                 <w:sz w:val="18"/>
               </w:rPr>
-              <w:t xml:space="preserve">  • Representación: </w:t>
+              <w:t xml:space="preserve">Representación: </w:t>
             </w:r>
             <w:r>
               <w:rPr>
@@ -3068,7 +4118,7 @@
                 <w:b/>
                 <w:sz w:val="18"/>
               </w:rPr>
-              <w:t xml:space="preserve">  • Acción y expresión: </w:t>
+              <w:t xml:space="preserve">Acción y expresión: </w:t>
             </w:r>
             <w:r>
               <w:rPr>
@@ -3088,7 +4138,7 @@
                 <w:b/>
                 <w:sz w:val="18"/>
               </w:rPr>
-              <w:t xml:space="preserve">  • Compromiso-Motivación: </w:t>
+              <w:t xml:space="preserve">Compromiso-Motivación: </w:t>
             </w:r>
             <w:r>
               <w:rPr>
@@ -3098,6 +4148,111 @@
               <w:t>Aplicación directa de los métodos de búsqueda y archivo documental.</w:t>
             </w:r>
           </w:p>
+          <w:tbl>
+            <w:tblPr>
+              <w:tblStyle w:val="Tablaconcuadrcula"/>
+              <w:tblW w:w="0" w:type="auto"/>
+              <w:jc w:val="center"/>
+              <w:tblLayout w:type="fixed"/>
+            </w:tblPr>
+            <w:tblGrid>
+              <w:gridCol w:w="683"/>
+              <w:gridCol w:w="683"/>
+              <w:gridCol w:w="683"/>
+            </w:tblGrid>
+            <w:tr>
+              <w:trPr>
+                <w:trHeight w:val="278"/>
+                <w:jc w:val="center"/>
+              </w:trPr>
+              <w:tc>
+                <w:tcPr>
+                  <w:tcW w:w="683" w:type="dxa"/>
+                  <w:shd w:val="clear" w:color="auto" w:fill="7030A0"/>
+                </w:tcPr>
+                <w:p>
+                  <w:pPr>
+                    <w:pStyle w:val="Sinespaciado"/>
+                    <w:jc w:val="center"/>
+                    <w:rPr>
+                      <w:rFonts w:ascii="Times New Roman" w:hAnsi="Times New Roman" w:cs="Times New Roman"/>
+                      <w:b/>
+                      <w:color w:val="FFFFFF"/>
+                      <w:sz w:val="20"/>
+                    </w:rPr>
+                  </w:pPr>
+                  <w:r>
+                    <w:rPr>
+                      <w:rFonts w:ascii="Times New Roman" w:hAnsi="Times New Roman" w:cs="Times New Roman"/>
+                      <w:b/>
+                      <w:color w:val="FFFFFF"/>
+                      <w:sz w:val="20"/>
+                    </w:rPr>
+                    <w:t>R</w:t>
+                  </w:r>
+                </w:p>
+              </w:tc>
+              <w:tc>
+                <w:tcPr>
+                  <w:tcW w:w="683" w:type="dxa"/>
+                  <w:shd w:val="clear" w:color="auto" w:fill="00B0F0"/>
+                </w:tcPr>
+                <w:p>
+                  <w:pPr>
+                    <w:pStyle w:val="Sinespaciado"/>
+                    <w:jc w:val="center"/>
+                    <w:rPr>
+                      <w:rFonts w:ascii="Times New Roman" w:hAnsi="Times New Roman" w:cs="Times New Roman"/>
+                      <w:b/>
+                      <w:color w:val="FFFFFF"/>
+                      <w:sz w:val="20"/>
+                    </w:rPr>
+                  </w:pPr>
+                  <w:r>
+                    <w:rPr>
+                      <w:rFonts w:ascii="Times New Roman" w:hAnsi="Times New Roman" w:cs="Times New Roman"/>
+                      <w:b/>
+                      <w:color w:val="FFFFFF"/>
+                      <w:sz w:val="20"/>
+                    </w:rPr>
+                    <w:t>A-E</w:t>
+                  </w:r>
+                </w:p>
+              </w:tc>
+              <w:tc>
+                <w:tcPr>
+                  <w:tcW w:w="683" w:type="dxa"/>
+                  <w:shd w:val="clear" w:color="auto" w:fill="538135"/>
+                </w:tcPr>
+                <w:p>
+                  <w:pPr>
+                    <w:pStyle w:val="Sinespaciado"/>
+                    <w:jc w:val="center"/>
+                    <w:rPr>
+                      <w:rFonts w:ascii="Times New Roman" w:hAnsi="Times New Roman" w:cs="Times New Roman"/>
+                      <w:b/>
+                      <w:color w:val="FFFFFF"/>
+                      <w:sz w:val="20"/>
+                    </w:rPr>
+                  </w:pPr>
+                  <w:r>
+                    <w:rPr>
+                      <w:rFonts w:ascii="Times New Roman" w:hAnsi="Times New Roman" w:cs="Times New Roman"/>
+                      <w:b/>
+                      <w:color w:val="FFFFFF"/>
+                      <w:sz w:val="20"/>
+                    </w:rPr>
+                    <w:t>C-M</w:t>
+                  </w:r>
+                </w:p>
+              </w:tc>
+            </w:tr>
+          </w:tbl>
+          <w:p>
+            <w:pPr>
+              <w:spacing w:before="40" w:after="40"/>
+            </w:pPr>
+          </w:p>
           <w:p>
             <w:pPr>
               <w:spacing w:before="60" w:after="20"/>
@@ -3166,7 +4321,7 @@
                 <w:b/>
                 <w:sz w:val="18"/>
               </w:rPr>
-              <w:t xml:space="preserve">  • Representación: </w:t>
+              <w:t xml:space="preserve">Representación: </w:t>
             </w:r>
             <w:r>
               <w:rPr>
@@ -3186,7 +4341,7 @@
                 <w:b/>
                 <w:sz w:val="18"/>
               </w:rPr>
-              <w:t xml:space="preserve">  • Acción y expresión: </w:t>
+              <w:t xml:space="preserve">Acción y expresión: </w:t>
             </w:r>
             <w:r>
               <w:rPr>
@@ -3206,7 +4361,7 @@
                 <w:b/>
                 <w:sz w:val="18"/>
               </w:rPr>
-              <w:t xml:space="preserve">  • Compromiso-Motivación: </w:t>
+              <w:t xml:space="preserve">Compromiso-Motivación: </w:t>
             </w:r>
             <w:r>
               <w:rPr>
@@ -3215,6 +4370,111 @@
               </w:rPr>
               <w:t>Celebración de la lectura comprensiva y rigurosa.</w:t>
             </w:r>
+          </w:p>
+          <w:tbl>
+            <w:tblPr>
+              <w:tblStyle w:val="Tablaconcuadrcula"/>
+              <w:tblW w:w="0" w:type="auto"/>
+              <w:jc w:val="center"/>
+              <w:tblLayout w:type="fixed"/>
+            </w:tblPr>
+            <w:tblGrid>
+              <w:gridCol w:w="683"/>
+              <w:gridCol w:w="683"/>
+              <w:gridCol w:w="683"/>
+            </w:tblGrid>
+            <w:tr>
+              <w:trPr>
+                <w:trHeight w:val="278"/>
+                <w:jc w:val="center"/>
+              </w:trPr>
+              <w:tc>
+                <w:tcPr>
+                  <w:tcW w:w="683" w:type="dxa"/>
+                  <w:shd w:val="clear" w:color="auto" w:fill="7030A0"/>
+                </w:tcPr>
+                <w:p>
+                  <w:pPr>
+                    <w:pStyle w:val="Sinespaciado"/>
+                    <w:jc w:val="center"/>
+                    <w:rPr>
+                      <w:rFonts w:ascii="Times New Roman" w:hAnsi="Times New Roman" w:cs="Times New Roman"/>
+                      <w:b/>
+                      <w:color w:val="FFFFFF"/>
+                      <w:sz w:val="20"/>
+                    </w:rPr>
+                  </w:pPr>
+                  <w:r>
+                    <w:rPr>
+                      <w:rFonts w:ascii="Times New Roman" w:hAnsi="Times New Roman" w:cs="Times New Roman"/>
+                      <w:b/>
+                      <w:color w:val="FFFFFF"/>
+                      <w:sz w:val="20"/>
+                    </w:rPr>
+                    <w:t>R</w:t>
+                  </w:r>
+                </w:p>
+              </w:tc>
+              <w:tc>
+                <w:tcPr>
+                  <w:tcW w:w="683" w:type="dxa"/>
+                  <w:shd w:val="clear" w:color="auto" w:fill="00B0F0"/>
+                </w:tcPr>
+                <w:p>
+                  <w:pPr>
+                    <w:pStyle w:val="Sinespaciado"/>
+                    <w:jc w:val="center"/>
+                    <w:rPr>
+                      <w:rFonts w:ascii="Times New Roman" w:hAnsi="Times New Roman" w:cs="Times New Roman"/>
+                      <w:b/>
+                      <w:color w:val="FFFFFF"/>
+                      <w:sz w:val="20"/>
+                    </w:rPr>
+                  </w:pPr>
+                  <w:r>
+                    <w:rPr>
+                      <w:rFonts w:ascii="Times New Roman" w:hAnsi="Times New Roman" w:cs="Times New Roman"/>
+                      <w:b/>
+                      <w:color w:val="FFFFFF"/>
+                      <w:sz w:val="20"/>
+                    </w:rPr>
+                    <w:t>A-E</w:t>
+                  </w:r>
+                </w:p>
+              </w:tc>
+              <w:tc>
+                <w:tcPr>
+                  <w:tcW w:w="683" w:type="dxa"/>
+                  <w:shd w:val="clear" w:color="auto" w:fill="538135"/>
+                </w:tcPr>
+                <w:p>
+                  <w:pPr>
+                    <w:pStyle w:val="Sinespaciado"/>
+                    <w:jc w:val="center"/>
+                    <w:rPr>
+                      <w:rFonts w:ascii="Times New Roman" w:hAnsi="Times New Roman" w:cs="Times New Roman"/>
+                      <w:b/>
+                      <w:color w:val="FFFFFF"/>
+                      <w:sz w:val="20"/>
+                    </w:rPr>
+                  </w:pPr>
+                  <w:r>
+                    <w:rPr>
+                      <w:rFonts w:ascii="Times New Roman" w:hAnsi="Times New Roman" w:cs="Times New Roman"/>
+                      <w:b/>
+                      <w:color w:val="FFFFFF"/>
+                      <w:sz w:val="20"/>
+                    </w:rPr>
+                    <w:t>C-M</w:t>
+                  </w:r>
+                </w:p>
+              </w:tc>
+            </w:tr>
+          </w:tbl>
+          <w:p>
+            <w:pPr>
+              <w:spacing w:before="40" w:after="40"/>
+            </w:pPr>
           </w:p>
         </w:tc>
         <w:tc>
@@ -3412,7 +4672,7 @@
                 <w:b/>
                 <w:sz w:val="18"/>
               </w:rPr>
-              <w:t xml:space="preserve">  • Representación: </w:t>
+              <w:t xml:space="preserve">Representación: </w:t>
             </w:r>
             <w:r>
               <w:rPr>
@@ -3432,7 +4692,7 @@
                 <w:b/>
                 <w:sz w:val="18"/>
               </w:rPr>
-              <w:t xml:space="preserve">  • Acción y expresión: </w:t>
+              <w:t xml:space="preserve">Acción y expresión: </w:t>
             </w:r>
             <w:r>
               <w:rPr>
@@ -3452,7 +4712,7 @@
                 <w:b/>
                 <w:sz w:val="18"/>
               </w:rPr>
-              <w:t xml:space="preserve">  • Compromiso-Motivación: </w:t>
+              <w:t xml:space="preserve">Compromiso-Motivación: </w:t>
             </w:r>
             <w:r>
               <w:rPr>
@@ -3462,6 +4722,111 @@
               <w:t>Sentido de propósito real: escribir para ser leídos por la comunidad escolar.</w:t>
             </w:r>
           </w:p>
+          <w:tbl>
+            <w:tblPr>
+              <w:tblStyle w:val="Tablaconcuadrcula"/>
+              <w:tblW w:w="0" w:type="auto"/>
+              <w:jc w:val="center"/>
+              <w:tblLayout w:type="fixed"/>
+            </w:tblPr>
+            <w:tblGrid>
+              <w:gridCol w:w="683"/>
+              <w:gridCol w:w="683"/>
+              <w:gridCol w:w="683"/>
+            </w:tblGrid>
+            <w:tr>
+              <w:trPr>
+                <w:trHeight w:val="278"/>
+                <w:jc w:val="center"/>
+              </w:trPr>
+              <w:tc>
+                <w:tcPr>
+                  <w:tcW w:w="683" w:type="dxa"/>
+                  <w:shd w:val="clear" w:color="auto" w:fill="7030A0"/>
+                </w:tcPr>
+                <w:p>
+                  <w:pPr>
+                    <w:pStyle w:val="Sinespaciado"/>
+                    <w:jc w:val="center"/>
+                    <w:rPr>
+                      <w:rFonts w:ascii="Times New Roman" w:hAnsi="Times New Roman" w:cs="Times New Roman"/>
+                      <w:b/>
+                      <w:color w:val="FFFFFF"/>
+                      <w:sz w:val="20"/>
+                    </w:rPr>
+                  </w:pPr>
+                  <w:r>
+                    <w:rPr>
+                      <w:rFonts w:ascii="Times New Roman" w:hAnsi="Times New Roman" w:cs="Times New Roman"/>
+                      <w:b/>
+                      <w:color w:val="FFFFFF"/>
+                      <w:sz w:val="20"/>
+                    </w:rPr>
+                    <w:t>R</w:t>
+                  </w:r>
+                </w:p>
+              </w:tc>
+              <w:tc>
+                <w:tcPr>
+                  <w:tcW w:w="683" w:type="dxa"/>
+                  <w:shd w:val="clear" w:color="auto" w:fill="00B0F0"/>
+                </w:tcPr>
+                <w:p>
+                  <w:pPr>
+                    <w:pStyle w:val="Sinespaciado"/>
+                    <w:jc w:val="center"/>
+                    <w:rPr>
+                      <w:rFonts w:ascii="Times New Roman" w:hAnsi="Times New Roman" w:cs="Times New Roman"/>
+                      <w:b/>
+                      <w:color w:val="FFFFFF"/>
+                      <w:sz w:val="20"/>
+                    </w:rPr>
+                  </w:pPr>
+                  <w:r>
+                    <w:rPr>
+                      <w:rFonts w:ascii="Times New Roman" w:hAnsi="Times New Roman" w:cs="Times New Roman"/>
+                      <w:b/>
+                      <w:color w:val="FFFFFF"/>
+                      <w:sz w:val="20"/>
+                    </w:rPr>
+                    <w:t>A-E</w:t>
+                  </w:r>
+                </w:p>
+              </w:tc>
+              <w:tc>
+                <w:tcPr>
+                  <w:tcW w:w="683" w:type="dxa"/>
+                  <w:shd w:val="clear" w:color="auto" w:fill="538135"/>
+                </w:tcPr>
+                <w:p>
+                  <w:pPr>
+                    <w:pStyle w:val="Sinespaciado"/>
+                    <w:jc w:val="center"/>
+                    <w:rPr>
+                      <w:rFonts w:ascii="Times New Roman" w:hAnsi="Times New Roman" w:cs="Times New Roman"/>
+                      <w:b/>
+                      <w:color w:val="FFFFFF"/>
+                      <w:sz w:val="20"/>
+                    </w:rPr>
+                  </w:pPr>
+                  <w:r>
+                    <w:rPr>
+                      <w:rFonts w:ascii="Times New Roman" w:hAnsi="Times New Roman" w:cs="Times New Roman"/>
+                      <w:b/>
+                      <w:color w:val="FFFFFF"/>
+                      <w:sz w:val="20"/>
+                    </w:rPr>
+                    <w:t>C-M</w:t>
+                  </w:r>
+                </w:p>
+              </w:tc>
+            </w:tr>
+          </w:tbl>
+          <w:p>
+            <w:pPr>
+              <w:spacing w:before="40" w:after="40"/>
+            </w:pPr>
+          </w:p>
           <w:p>
             <w:pPr>
               <w:spacing w:before="60" w:after="20"/>
@@ -3530,7 +4895,7 @@
                 <w:b/>
                 <w:sz w:val="18"/>
               </w:rPr>
-              <w:t xml:space="preserve">  • Representación: </w:t>
+              <w:t xml:space="preserve">Representación: </w:t>
             </w:r>
             <w:r>
               <w:rPr>
@@ -3550,7 +4915,7 @@
                 <w:b/>
                 <w:sz w:val="18"/>
               </w:rPr>
-              <w:t xml:space="preserve">  • Acción y expresión: </w:t>
+              <w:t xml:space="preserve">Acción y expresión: </w:t>
             </w:r>
             <w:r>
               <w:rPr>
@@ -3570,7 +4935,7 @@
                 <w:b/>
                 <w:sz w:val="18"/>
               </w:rPr>
-              <w:t xml:space="preserve">  • Compromiso-Motivación: </w:t>
+              <w:t xml:space="preserve">Compromiso-Motivación: </w:t>
             </w:r>
             <w:r>
               <w:rPr>
@@ -3580,6 +4945,111 @@
               <w:t>Descubrimiento lógico y lúdico de la estructura gramatical del idioma.</w:t>
             </w:r>
           </w:p>
+          <w:tbl>
+            <w:tblPr>
+              <w:tblStyle w:val="Tablaconcuadrcula"/>
+              <w:tblW w:w="0" w:type="auto"/>
+              <w:jc w:val="center"/>
+              <w:tblLayout w:type="fixed"/>
+            </w:tblPr>
+            <w:tblGrid>
+              <w:gridCol w:w="683"/>
+              <w:gridCol w:w="683"/>
+              <w:gridCol w:w="683"/>
+            </w:tblGrid>
+            <w:tr>
+              <w:trPr>
+                <w:trHeight w:val="278"/>
+                <w:jc w:val="center"/>
+              </w:trPr>
+              <w:tc>
+                <w:tcPr>
+                  <w:tcW w:w="683" w:type="dxa"/>
+                  <w:shd w:val="clear" w:color="auto" w:fill="7030A0"/>
+                </w:tcPr>
+                <w:p>
+                  <w:pPr>
+                    <w:pStyle w:val="Sinespaciado"/>
+                    <w:jc w:val="center"/>
+                    <w:rPr>
+                      <w:rFonts w:ascii="Times New Roman" w:hAnsi="Times New Roman" w:cs="Times New Roman"/>
+                      <w:b/>
+                      <w:color w:val="FFFFFF"/>
+                      <w:sz w:val="20"/>
+                    </w:rPr>
+                  </w:pPr>
+                  <w:r>
+                    <w:rPr>
+                      <w:rFonts w:ascii="Times New Roman" w:hAnsi="Times New Roman" w:cs="Times New Roman"/>
+                      <w:b/>
+                      <w:color w:val="FFFFFF"/>
+                      <w:sz w:val="20"/>
+                    </w:rPr>
+                    <w:t>R</w:t>
+                  </w:r>
+                </w:p>
+              </w:tc>
+              <w:tc>
+                <w:tcPr>
+                  <w:tcW w:w="683" w:type="dxa"/>
+                  <w:shd w:val="clear" w:color="auto" w:fill="00B0F0"/>
+                </w:tcPr>
+                <w:p>
+                  <w:pPr>
+                    <w:pStyle w:val="Sinespaciado"/>
+                    <w:jc w:val="center"/>
+                    <w:rPr>
+                      <w:rFonts w:ascii="Times New Roman" w:hAnsi="Times New Roman" w:cs="Times New Roman"/>
+                      <w:b/>
+                      <w:color w:val="FFFFFF"/>
+                      <w:sz w:val="20"/>
+                    </w:rPr>
+                  </w:pPr>
+                  <w:r>
+                    <w:rPr>
+                      <w:rFonts w:ascii="Times New Roman" w:hAnsi="Times New Roman" w:cs="Times New Roman"/>
+                      <w:b/>
+                      <w:color w:val="FFFFFF"/>
+                      <w:sz w:val="20"/>
+                    </w:rPr>
+                    <w:t>A-E</w:t>
+                  </w:r>
+                </w:p>
+              </w:tc>
+              <w:tc>
+                <w:tcPr>
+                  <w:tcW w:w="683" w:type="dxa"/>
+                  <w:shd w:val="clear" w:color="auto" w:fill="538135"/>
+                </w:tcPr>
+                <w:p>
+                  <w:pPr>
+                    <w:pStyle w:val="Sinespaciado"/>
+                    <w:jc w:val="center"/>
+                    <w:rPr>
+                      <w:rFonts w:ascii="Times New Roman" w:hAnsi="Times New Roman" w:cs="Times New Roman"/>
+                      <w:b/>
+                      <w:color w:val="FFFFFF"/>
+                      <w:sz w:val="20"/>
+                    </w:rPr>
+                  </w:pPr>
+                  <w:r>
+                    <w:rPr>
+                      <w:rFonts w:ascii="Times New Roman" w:hAnsi="Times New Roman" w:cs="Times New Roman"/>
+                      <w:b/>
+                      <w:color w:val="FFFFFF"/>
+                      <w:sz w:val="20"/>
+                    </w:rPr>
+                    <w:t>C-M</w:t>
+                  </w:r>
+                </w:p>
+              </w:tc>
+            </w:tr>
+          </w:tbl>
+          <w:p>
+            <w:pPr>
+              <w:spacing w:before="40" w:after="40"/>
+            </w:pPr>
+          </w:p>
           <w:p>
             <w:pPr>
               <w:spacing w:before="60" w:after="20"/>
@@ -3648,7 +5118,7 @@
                 <w:b/>
                 <w:sz w:val="18"/>
               </w:rPr>
-              <w:t xml:space="preserve">  • Representación: </w:t>
+              <w:t xml:space="preserve">Representación: </w:t>
             </w:r>
             <w:r>
               <w:rPr>
@@ -3668,7 +5138,7 @@
                 <w:b/>
                 <w:sz w:val="18"/>
               </w:rPr>
-              <w:t xml:space="preserve">  • Acción y expresión: </w:t>
+              <w:t xml:space="preserve">Acción y expresión: </w:t>
             </w:r>
             <w:r>
               <w:rPr>
@@ -3688,7 +5158,7 @@
                 <w:b/>
                 <w:sz w:val="18"/>
               </w:rPr>
-              <w:t xml:space="preserve">  • Compromiso-Motivación: </w:t>
+              <w:t xml:space="preserve">Compromiso-Motivación: </w:t>
             </w:r>
             <w:r>
               <w:rPr>
@@ -3698,6 +5168,111 @@
               <w:t>Orgullo por la creación de un texto informativo de calidad.</w:t>
             </w:r>
           </w:p>
+          <w:tbl>
+            <w:tblPr>
+              <w:tblStyle w:val="Tablaconcuadrcula"/>
+              <w:tblW w:w="0" w:type="auto"/>
+              <w:jc w:val="center"/>
+              <w:tblLayout w:type="fixed"/>
+            </w:tblPr>
+            <w:tblGrid>
+              <w:gridCol w:w="683"/>
+              <w:gridCol w:w="683"/>
+              <w:gridCol w:w="683"/>
+            </w:tblGrid>
+            <w:tr>
+              <w:trPr>
+                <w:trHeight w:val="278"/>
+                <w:jc w:val="center"/>
+              </w:trPr>
+              <w:tc>
+                <w:tcPr>
+                  <w:tcW w:w="683" w:type="dxa"/>
+                  <w:shd w:val="clear" w:color="auto" w:fill="7030A0"/>
+                </w:tcPr>
+                <w:p>
+                  <w:pPr>
+                    <w:pStyle w:val="Sinespaciado"/>
+                    <w:jc w:val="center"/>
+                    <w:rPr>
+                      <w:rFonts w:ascii="Times New Roman" w:hAnsi="Times New Roman" w:cs="Times New Roman"/>
+                      <w:b/>
+                      <w:color w:val="FFFFFF"/>
+                      <w:sz w:val="20"/>
+                    </w:rPr>
+                  </w:pPr>
+                  <w:r>
+                    <w:rPr>
+                      <w:rFonts w:ascii="Times New Roman" w:hAnsi="Times New Roman" w:cs="Times New Roman"/>
+                      <w:b/>
+                      <w:color w:val="FFFFFF"/>
+                      <w:sz w:val="20"/>
+                    </w:rPr>
+                    <w:t>R</w:t>
+                  </w:r>
+                </w:p>
+              </w:tc>
+              <w:tc>
+                <w:tcPr>
+                  <w:tcW w:w="683" w:type="dxa"/>
+                  <w:shd w:val="clear" w:color="auto" w:fill="00B0F0"/>
+                </w:tcPr>
+                <w:p>
+                  <w:pPr>
+                    <w:pStyle w:val="Sinespaciado"/>
+                    <w:jc w:val="center"/>
+                    <w:rPr>
+                      <w:rFonts w:ascii="Times New Roman" w:hAnsi="Times New Roman" w:cs="Times New Roman"/>
+                      <w:b/>
+                      <w:color w:val="FFFFFF"/>
+                      <w:sz w:val="20"/>
+                    </w:rPr>
+                  </w:pPr>
+                  <w:r>
+                    <w:rPr>
+                      <w:rFonts w:ascii="Times New Roman" w:hAnsi="Times New Roman" w:cs="Times New Roman"/>
+                      <w:b/>
+                      <w:color w:val="FFFFFF"/>
+                      <w:sz w:val="20"/>
+                    </w:rPr>
+                    <w:t>A-E</w:t>
+                  </w:r>
+                </w:p>
+              </w:tc>
+              <w:tc>
+                <w:tcPr>
+                  <w:tcW w:w="683" w:type="dxa"/>
+                  <w:shd w:val="clear" w:color="auto" w:fill="538135"/>
+                </w:tcPr>
+                <w:p>
+                  <w:pPr>
+                    <w:pStyle w:val="Sinespaciado"/>
+                    <w:jc w:val="center"/>
+                    <w:rPr>
+                      <w:rFonts w:ascii="Times New Roman" w:hAnsi="Times New Roman" w:cs="Times New Roman"/>
+                      <w:b/>
+                      <w:color w:val="FFFFFF"/>
+                      <w:sz w:val="20"/>
+                    </w:rPr>
+                  </w:pPr>
+                  <w:r>
+                    <w:rPr>
+                      <w:rFonts w:ascii="Times New Roman" w:hAnsi="Times New Roman" w:cs="Times New Roman"/>
+                      <w:b/>
+                      <w:color w:val="FFFFFF"/>
+                      <w:sz w:val="20"/>
+                    </w:rPr>
+                    <w:t>C-M</w:t>
+                  </w:r>
+                </w:p>
+              </w:tc>
+            </w:tr>
+          </w:tbl>
+          <w:p>
+            <w:pPr>
+              <w:spacing w:before="40" w:after="40"/>
+            </w:pPr>
+          </w:p>
           <w:p>
             <w:pPr>
               <w:spacing w:before="60" w:after="20"/>
@@ -3766,7 +5341,7 @@
                 <w:b/>
                 <w:sz w:val="18"/>
               </w:rPr>
-              <w:t xml:space="preserve">  • Representación: </w:t>
+              <w:t xml:space="preserve">Representación: </w:t>
             </w:r>
             <w:r>
               <w:rPr>
@@ -3786,7 +5361,7 @@
                 <w:b/>
                 <w:sz w:val="18"/>
               </w:rPr>
-              <w:t xml:space="preserve">  • Acción y expresión: </w:t>
+              <w:t xml:space="preserve">Acción y expresión: </w:t>
             </w:r>
             <w:r>
               <w:rPr>
@@ -3806,7 +5381,7 @@
                 <w:b/>
                 <w:sz w:val="18"/>
               </w:rPr>
-              <w:t xml:space="preserve">  • Compromiso-Motivación: </w:t>
+              <w:t xml:space="preserve">Compromiso-Motivación: </w:t>
             </w:r>
             <w:r>
               <w:rPr>
@@ -3815,6 +5390,111 @@
               </w:rPr>
               <w:t>Cierre exitoso del ciclo de producción escrita.</w:t>
             </w:r>
+          </w:p>
+          <w:tbl>
+            <w:tblPr>
+              <w:tblStyle w:val="Tablaconcuadrcula"/>
+              <w:tblW w:w="0" w:type="auto"/>
+              <w:jc w:val="center"/>
+              <w:tblLayout w:type="fixed"/>
+            </w:tblPr>
+            <w:tblGrid>
+              <w:gridCol w:w="683"/>
+              <w:gridCol w:w="683"/>
+              <w:gridCol w:w="683"/>
+            </w:tblGrid>
+            <w:tr>
+              <w:trPr>
+                <w:trHeight w:val="278"/>
+                <w:jc w:val="center"/>
+              </w:trPr>
+              <w:tc>
+                <w:tcPr>
+                  <w:tcW w:w="683" w:type="dxa"/>
+                  <w:shd w:val="clear" w:color="auto" w:fill="7030A0"/>
+                </w:tcPr>
+                <w:p>
+                  <w:pPr>
+                    <w:pStyle w:val="Sinespaciado"/>
+                    <w:jc w:val="center"/>
+                    <w:rPr>
+                      <w:rFonts w:ascii="Times New Roman" w:hAnsi="Times New Roman" w:cs="Times New Roman"/>
+                      <w:b/>
+                      <w:color w:val="FFFFFF"/>
+                      <w:sz w:val="20"/>
+                    </w:rPr>
+                  </w:pPr>
+                  <w:r>
+                    <w:rPr>
+                      <w:rFonts w:ascii="Times New Roman" w:hAnsi="Times New Roman" w:cs="Times New Roman"/>
+                      <w:b/>
+                      <w:color w:val="FFFFFF"/>
+                      <w:sz w:val="20"/>
+                    </w:rPr>
+                    <w:t>R</w:t>
+                  </w:r>
+                </w:p>
+              </w:tc>
+              <w:tc>
+                <w:tcPr>
+                  <w:tcW w:w="683" w:type="dxa"/>
+                  <w:shd w:val="clear" w:color="auto" w:fill="00B0F0"/>
+                </w:tcPr>
+                <w:p>
+                  <w:pPr>
+                    <w:pStyle w:val="Sinespaciado"/>
+                    <w:jc w:val="center"/>
+                    <w:rPr>
+                      <w:rFonts w:ascii="Times New Roman" w:hAnsi="Times New Roman" w:cs="Times New Roman"/>
+                      <w:b/>
+                      <w:color w:val="FFFFFF"/>
+                      <w:sz w:val="20"/>
+                    </w:rPr>
+                  </w:pPr>
+                  <w:r>
+                    <w:rPr>
+                      <w:rFonts w:ascii="Times New Roman" w:hAnsi="Times New Roman" w:cs="Times New Roman"/>
+                      <w:b/>
+                      <w:color w:val="FFFFFF"/>
+                      <w:sz w:val="20"/>
+                    </w:rPr>
+                    <w:t>A-E</w:t>
+                  </w:r>
+                </w:p>
+              </w:tc>
+              <w:tc>
+                <w:tcPr>
+                  <w:tcW w:w="683" w:type="dxa"/>
+                  <w:shd w:val="clear" w:color="auto" w:fill="538135"/>
+                </w:tcPr>
+                <w:p>
+                  <w:pPr>
+                    <w:pStyle w:val="Sinespaciado"/>
+                    <w:jc w:val="center"/>
+                    <w:rPr>
+                      <w:rFonts w:ascii="Times New Roman" w:hAnsi="Times New Roman" w:cs="Times New Roman"/>
+                      <w:b/>
+                      <w:color w:val="FFFFFF"/>
+                      <w:sz w:val="20"/>
+                    </w:rPr>
+                  </w:pPr>
+                  <w:r>
+                    <w:rPr>
+                      <w:rFonts w:ascii="Times New Roman" w:hAnsi="Times New Roman" w:cs="Times New Roman"/>
+                      <w:b/>
+                      <w:color w:val="FFFFFF"/>
+                      <w:sz w:val="20"/>
+                    </w:rPr>
+                    <w:t>C-M</w:t>
+                  </w:r>
+                </w:p>
+              </w:tc>
+            </w:tr>
+          </w:tbl>
+          <w:p>
+            <w:pPr>
+              <w:spacing w:before="40" w:after="40"/>
+            </w:pPr>
           </w:p>
         </w:tc>
         <w:tc>
@@ -4006,7 +5686,7 @@
                 <w:b/>
                 <w:sz w:val="18"/>
               </w:rPr>
-              <w:t xml:space="preserve">  • Representación: </w:t>
+              <w:t xml:space="preserve">Representación: </w:t>
             </w:r>
             <w:r>
               <w:rPr>
@@ -4026,7 +5706,7 @@
                 <w:b/>
                 <w:sz w:val="18"/>
               </w:rPr>
-              <w:t xml:space="preserve">  • Acción y expresión: </w:t>
+              <w:t xml:space="preserve">Acción y expresión: </w:t>
             </w:r>
             <w:r>
               <w:rPr>
@@ -4046,7 +5726,7 @@
                 <w:b/>
                 <w:sz w:val="18"/>
               </w:rPr>
-              <w:t xml:space="preserve">  • Compromiso-Motivación: </w:t>
+              <w:t xml:space="preserve">Compromiso-Motivación: </w:t>
             </w:r>
             <w:r>
               <w:rPr>
@@ -4056,6 +5736,111 @@
               <w:t>Conexión con lo sagrado, la fantasía y la identidad intercultural.</w:t>
             </w:r>
           </w:p>
+          <w:tbl>
+            <w:tblPr>
+              <w:tblStyle w:val="Tablaconcuadrcula"/>
+              <w:tblW w:w="0" w:type="auto"/>
+              <w:jc w:val="center"/>
+              <w:tblLayout w:type="fixed"/>
+            </w:tblPr>
+            <w:tblGrid>
+              <w:gridCol w:w="683"/>
+              <w:gridCol w:w="683"/>
+              <w:gridCol w:w="683"/>
+            </w:tblGrid>
+            <w:tr>
+              <w:trPr>
+                <w:trHeight w:val="278"/>
+                <w:jc w:val="center"/>
+              </w:trPr>
+              <w:tc>
+                <w:tcPr>
+                  <w:tcW w:w="683" w:type="dxa"/>
+                  <w:shd w:val="clear" w:color="auto" w:fill="7030A0"/>
+                </w:tcPr>
+                <w:p>
+                  <w:pPr>
+                    <w:pStyle w:val="Sinespaciado"/>
+                    <w:jc w:val="center"/>
+                    <w:rPr>
+                      <w:rFonts w:ascii="Times New Roman" w:hAnsi="Times New Roman" w:cs="Times New Roman"/>
+                      <w:b/>
+                      <w:color w:val="FFFFFF"/>
+                      <w:sz w:val="20"/>
+                    </w:rPr>
+                  </w:pPr>
+                  <w:r>
+                    <w:rPr>
+                      <w:rFonts w:ascii="Times New Roman" w:hAnsi="Times New Roman" w:cs="Times New Roman"/>
+                      <w:b/>
+                      <w:color w:val="FFFFFF"/>
+                      <w:sz w:val="20"/>
+                    </w:rPr>
+                    <w:t>R</w:t>
+                  </w:r>
+                </w:p>
+              </w:tc>
+              <w:tc>
+                <w:tcPr>
+                  <w:tcW w:w="683" w:type="dxa"/>
+                  <w:shd w:val="clear" w:color="auto" w:fill="00B0F0"/>
+                </w:tcPr>
+                <w:p>
+                  <w:pPr>
+                    <w:pStyle w:val="Sinespaciado"/>
+                    <w:jc w:val="center"/>
+                    <w:rPr>
+                      <w:rFonts w:ascii="Times New Roman" w:hAnsi="Times New Roman" w:cs="Times New Roman"/>
+                      <w:b/>
+                      <w:color w:val="FFFFFF"/>
+                      <w:sz w:val="20"/>
+                    </w:rPr>
+                  </w:pPr>
+                  <w:r>
+                    <w:rPr>
+                      <w:rFonts w:ascii="Times New Roman" w:hAnsi="Times New Roman" w:cs="Times New Roman"/>
+                      <w:b/>
+                      <w:color w:val="FFFFFF"/>
+                      <w:sz w:val="20"/>
+                    </w:rPr>
+                    <w:t>A-E</w:t>
+                  </w:r>
+                </w:p>
+              </w:tc>
+              <w:tc>
+                <w:tcPr>
+                  <w:tcW w:w="683" w:type="dxa"/>
+                  <w:shd w:val="clear" w:color="auto" w:fill="538135"/>
+                </w:tcPr>
+                <w:p>
+                  <w:pPr>
+                    <w:pStyle w:val="Sinespaciado"/>
+                    <w:jc w:val="center"/>
+                    <w:rPr>
+                      <w:rFonts w:ascii="Times New Roman" w:hAnsi="Times New Roman" w:cs="Times New Roman"/>
+                      <w:b/>
+                      <w:color w:val="FFFFFF"/>
+                      <w:sz w:val="20"/>
+                    </w:rPr>
+                  </w:pPr>
+                  <w:r>
+                    <w:rPr>
+                      <w:rFonts w:ascii="Times New Roman" w:hAnsi="Times New Roman" w:cs="Times New Roman"/>
+                      <w:b/>
+                      <w:color w:val="FFFFFF"/>
+                      <w:sz w:val="20"/>
+                    </w:rPr>
+                    <w:t>C-M</w:t>
+                  </w:r>
+                </w:p>
+              </w:tc>
+            </w:tr>
+          </w:tbl>
+          <w:p>
+            <w:pPr>
+              <w:spacing w:before="40" w:after="40"/>
+            </w:pPr>
+          </w:p>
           <w:p>
             <w:pPr>
               <w:spacing w:before="60" w:after="20"/>
@@ -4124,7 +5909,7 @@
                 <w:b/>
                 <w:sz w:val="18"/>
               </w:rPr>
-              <w:t xml:space="preserve">  • Representación: </w:t>
+              <w:t xml:space="preserve">Representación: </w:t>
             </w:r>
             <w:r>
               <w:rPr>
@@ -4144,7 +5929,7 @@
                 <w:b/>
                 <w:sz w:val="18"/>
               </w:rPr>
-              <w:t xml:space="preserve">  • Acción y expresión: </w:t>
+              <w:t xml:space="preserve">Acción y expresión: </w:t>
             </w:r>
             <w:r>
               <w:rPr>
@@ -4164,7 +5949,7 @@
                 <w:b/>
                 <w:sz w:val="18"/>
               </w:rPr>
-              <w:t xml:space="preserve">  • Compromiso-Motivación: </w:t>
+              <w:t xml:space="preserve">Compromiso-Motivación: </w:t>
             </w:r>
             <w:r>
               <w:rPr>
@@ -4174,6 +5959,111 @@
               <w:t>Respeto profundo por las diversas cosmovisiones y memoria histórica.</w:t>
             </w:r>
           </w:p>
+          <w:tbl>
+            <w:tblPr>
+              <w:tblStyle w:val="Tablaconcuadrcula"/>
+              <w:tblW w:w="0" w:type="auto"/>
+              <w:jc w:val="center"/>
+              <w:tblLayout w:type="fixed"/>
+            </w:tblPr>
+            <w:tblGrid>
+              <w:gridCol w:w="683"/>
+              <w:gridCol w:w="683"/>
+              <w:gridCol w:w="683"/>
+            </w:tblGrid>
+            <w:tr>
+              <w:trPr>
+                <w:trHeight w:val="278"/>
+                <w:jc w:val="center"/>
+              </w:trPr>
+              <w:tc>
+                <w:tcPr>
+                  <w:tcW w:w="683" w:type="dxa"/>
+                  <w:shd w:val="clear" w:color="auto" w:fill="7030A0"/>
+                </w:tcPr>
+                <w:p>
+                  <w:pPr>
+                    <w:pStyle w:val="Sinespaciado"/>
+                    <w:jc w:val="center"/>
+                    <w:rPr>
+                      <w:rFonts w:ascii="Times New Roman" w:hAnsi="Times New Roman" w:cs="Times New Roman"/>
+                      <w:b/>
+                      <w:color w:val="FFFFFF"/>
+                      <w:sz w:val="20"/>
+                    </w:rPr>
+                  </w:pPr>
+                  <w:r>
+                    <w:rPr>
+                      <w:rFonts w:ascii="Times New Roman" w:hAnsi="Times New Roman" w:cs="Times New Roman"/>
+                      <w:b/>
+                      <w:color w:val="FFFFFF"/>
+                      <w:sz w:val="20"/>
+                    </w:rPr>
+                    <w:t>R</w:t>
+                  </w:r>
+                </w:p>
+              </w:tc>
+              <w:tc>
+                <w:tcPr>
+                  <w:tcW w:w="683" w:type="dxa"/>
+                  <w:shd w:val="clear" w:color="auto" w:fill="00B0F0"/>
+                </w:tcPr>
+                <w:p>
+                  <w:pPr>
+                    <w:pStyle w:val="Sinespaciado"/>
+                    <w:jc w:val="center"/>
+                    <w:rPr>
+                      <w:rFonts w:ascii="Times New Roman" w:hAnsi="Times New Roman" w:cs="Times New Roman"/>
+                      <w:b/>
+                      <w:color w:val="FFFFFF"/>
+                      <w:sz w:val="20"/>
+                    </w:rPr>
+                  </w:pPr>
+                  <w:r>
+                    <w:rPr>
+                      <w:rFonts w:ascii="Times New Roman" w:hAnsi="Times New Roman" w:cs="Times New Roman"/>
+                      <w:b/>
+                      <w:color w:val="FFFFFF"/>
+                      <w:sz w:val="20"/>
+                    </w:rPr>
+                    <w:t>A-E</w:t>
+                  </w:r>
+                </w:p>
+              </w:tc>
+              <w:tc>
+                <w:tcPr>
+                  <w:tcW w:w="683" w:type="dxa"/>
+                  <w:shd w:val="clear" w:color="auto" w:fill="538135"/>
+                </w:tcPr>
+                <w:p>
+                  <w:pPr>
+                    <w:pStyle w:val="Sinespaciado"/>
+                    <w:jc w:val="center"/>
+                    <w:rPr>
+                      <w:rFonts w:ascii="Times New Roman" w:hAnsi="Times New Roman" w:cs="Times New Roman"/>
+                      <w:b/>
+                      <w:color w:val="FFFFFF"/>
+                      <w:sz w:val="20"/>
+                    </w:rPr>
+                  </w:pPr>
+                  <w:r>
+                    <w:rPr>
+                      <w:rFonts w:ascii="Times New Roman" w:hAnsi="Times New Roman" w:cs="Times New Roman"/>
+                      <w:b/>
+                      <w:color w:val="FFFFFF"/>
+                      <w:sz w:val="20"/>
+                    </w:rPr>
+                    <w:t>C-M</w:t>
+                  </w:r>
+                </w:p>
+              </w:tc>
+            </w:tr>
+          </w:tbl>
+          <w:p>
+            <w:pPr>
+              <w:spacing w:before="40" w:after="40"/>
+            </w:pPr>
+          </w:p>
           <w:p>
             <w:pPr>
               <w:spacing w:before="60" w:after="20"/>
@@ -4242,7 +6132,7 @@
                 <w:b/>
                 <w:sz w:val="18"/>
               </w:rPr>
-              <w:t xml:space="preserve">  • Representación: </w:t>
+              <w:t xml:space="preserve">Representación: </w:t>
             </w:r>
             <w:r>
               <w:rPr>
@@ -4262,7 +6152,7 @@
                 <w:b/>
                 <w:sz w:val="18"/>
               </w:rPr>
-              <w:t xml:space="preserve">  • Acción y expresión: </w:t>
+              <w:t xml:space="preserve">Acción y expresión: </w:t>
             </w:r>
             <w:r>
               <w:rPr>
@@ -4282,7 +6172,7 @@
                 <w:b/>
                 <w:sz w:val="18"/>
               </w:rPr>
-              <w:t xml:space="preserve">  • Compromiso-Motivación: </w:t>
+              <w:t xml:space="preserve">Compromiso-Motivación: </w:t>
             </w:r>
             <w:r>
               <w:rPr>
@@ -4292,6 +6182,111 @@
               <w:t>Disfrute estético y recreación de la literatura tradicional.</w:t>
             </w:r>
           </w:p>
+          <w:tbl>
+            <w:tblPr>
+              <w:tblStyle w:val="Tablaconcuadrcula"/>
+              <w:tblW w:w="0" w:type="auto"/>
+              <w:jc w:val="center"/>
+              <w:tblLayout w:type="fixed"/>
+            </w:tblPr>
+            <w:tblGrid>
+              <w:gridCol w:w="683"/>
+              <w:gridCol w:w="683"/>
+              <w:gridCol w:w="683"/>
+            </w:tblGrid>
+            <w:tr>
+              <w:trPr>
+                <w:trHeight w:val="278"/>
+                <w:jc w:val="center"/>
+              </w:trPr>
+              <w:tc>
+                <w:tcPr>
+                  <w:tcW w:w="683" w:type="dxa"/>
+                  <w:shd w:val="clear" w:color="auto" w:fill="7030A0"/>
+                </w:tcPr>
+                <w:p>
+                  <w:pPr>
+                    <w:pStyle w:val="Sinespaciado"/>
+                    <w:jc w:val="center"/>
+                    <w:rPr>
+                      <w:rFonts w:ascii="Times New Roman" w:hAnsi="Times New Roman" w:cs="Times New Roman"/>
+                      <w:b/>
+                      <w:color w:val="FFFFFF"/>
+                      <w:sz w:val="20"/>
+                    </w:rPr>
+                  </w:pPr>
+                  <w:r>
+                    <w:rPr>
+                      <w:rFonts w:ascii="Times New Roman" w:hAnsi="Times New Roman" w:cs="Times New Roman"/>
+                      <w:b/>
+                      <w:color w:val="FFFFFF"/>
+                      <w:sz w:val="20"/>
+                    </w:rPr>
+                    <w:t>R</w:t>
+                  </w:r>
+                </w:p>
+              </w:tc>
+              <w:tc>
+                <w:tcPr>
+                  <w:tcW w:w="683" w:type="dxa"/>
+                  <w:shd w:val="clear" w:color="auto" w:fill="00B0F0"/>
+                </w:tcPr>
+                <w:p>
+                  <w:pPr>
+                    <w:pStyle w:val="Sinespaciado"/>
+                    <w:jc w:val="center"/>
+                    <w:rPr>
+                      <w:rFonts w:ascii="Times New Roman" w:hAnsi="Times New Roman" w:cs="Times New Roman"/>
+                      <w:b/>
+                      <w:color w:val="FFFFFF"/>
+                      <w:sz w:val="20"/>
+                    </w:rPr>
+                  </w:pPr>
+                  <w:r>
+                    <w:rPr>
+                      <w:rFonts w:ascii="Times New Roman" w:hAnsi="Times New Roman" w:cs="Times New Roman"/>
+                      <w:b/>
+                      <w:color w:val="FFFFFF"/>
+                      <w:sz w:val="20"/>
+                    </w:rPr>
+                    <w:t>A-E</w:t>
+                  </w:r>
+                </w:p>
+              </w:tc>
+              <w:tc>
+                <w:tcPr>
+                  <w:tcW w:w="683" w:type="dxa"/>
+                  <w:shd w:val="clear" w:color="auto" w:fill="538135"/>
+                </w:tcPr>
+                <w:p>
+                  <w:pPr>
+                    <w:pStyle w:val="Sinespaciado"/>
+                    <w:jc w:val="center"/>
+                    <w:rPr>
+                      <w:rFonts w:ascii="Times New Roman" w:hAnsi="Times New Roman" w:cs="Times New Roman"/>
+                      <w:b/>
+                      <w:color w:val="FFFFFF"/>
+                      <w:sz w:val="20"/>
+                    </w:rPr>
+                  </w:pPr>
+                  <w:r>
+                    <w:rPr>
+                      <w:rFonts w:ascii="Times New Roman" w:hAnsi="Times New Roman" w:cs="Times New Roman"/>
+                      <w:b/>
+                      <w:color w:val="FFFFFF"/>
+                      <w:sz w:val="20"/>
+                    </w:rPr>
+                    <w:t>C-M</w:t>
+                  </w:r>
+                </w:p>
+              </w:tc>
+            </w:tr>
+          </w:tbl>
+          <w:p>
+            <w:pPr>
+              <w:spacing w:before="40" w:after="40"/>
+            </w:pPr>
+          </w:p>
           <w:p>
             <w:pPr>
               <w:spacing w:before="60" w:after="20"/>
@@ -4360,7 +6355,7 @@
                 <w:b/>
                 <w:sz w:val="18"/>
               </w:rPr>
-              <w:t xml:space="preserve">  • Representación: </w:t>
+              <w:t xml:space="preserve">Representación: </w:t>
             </w:r>
             <w:r>
               <w:rPr>
@@ -4380,7 +6375,7 @@
                 <w:b/>
                 <w:sz w:val="18"/>
               </w:rPr>
-              <w:t xml:space="preserve">  • Acción y expresión: </w:t>
+              <w:t xml:space="preserve">Acción y expresión: </w:t>
             </w:r>
             <w:r>
               <w:rPr>
@@ -4400,7 +6395,7 @@
                 <w:b/>
                 <w:sz w:val="18"/>
               </w:rPr>
-              <w:t xml:space="preserve">  • Compromiso-Motivación: </w:t>
+              <w:t xml:space="preserve">Compromiso-Motivación: </w:t>
             </w:r>
             <w:r>
               <w:rPr>
@@ -4409,6 +6404,111 @@
               </w:rPr>
               <w:t>Valoración de la interculturalidad como tesoro vivo del Ecuador.</w:t>
             </w:r>
+          </w:p>
+          <w:tbl>
+            <w:tblPr>
+              <w:tblStyle w:val="Tablaconcuadrcula"/>
+              <w:tblW w:w="0" w:type="auto"/>
+              <w:jc w:val="center"/>
+              <w:tblLayout w:type="fixed"/>
+            </w:tblPr>
+            <w:tblGrid>
+              <w:gridCol w:w="683"/>
+              <w:gridCol w:w="683"/>
+              <w:gridCol w:w="683"/>
+            </w:tblGrid>
+            <w:tr>
+              <w:trPr>
+                <w:trHeight w:val="278"/>
+                <w:jc w:val="center"/>
+              </w:trPr>
+              <w:tc>
+                <w:tcPr>
+                  <w:tcW w:w="683" w:type="dxa"/>
+                  <w:shd w:val="clear" w:color="auto" w:fill="7030A0"/>
+                </w:tcPr>
+                <w:p>
+                  <w:pPr>
+                    <w:pStyle w:val="Sinespaciado"/>
+                    <w:jc w:val="center"/>
+                    <w:rPr>
+                      <w:rFonts w:ascii="Times New Roman" w:hAnsi="Times New Roman" w:cs="Times New Roman"/>
+                      <w:b/>
+                      <w:color w:val="FFFFFF"/>
+                      <w:sz w:val="20"/>
+                    </w:rPr>
+                  </w:pPr>
+                  <w:r>
+                    <w:rPr>
+                      <w:rFonts w:ascii="Times New Roman" w:hAnsi="Times New Roman" w:cs="Times New Roman"/>
+                      <w:b/>
+                      <w:color w:val="FFFFFF"/>
+                      <w:sz w:val="20"/>
+                    </w:rPr>
+                    <w:t>R</w:t>
+                  </w:r>
+                </w:p>
+              </w:tc>
+              <w:tc>
+                <w:tcPr>
+                  <w:tcW w:w="683" w:type="dxa"/>
+                  <w:shd w:val="clear" w:color="auto" w:fill="00B0F0"/>
+                </w:tcPr>
+                <w:p>
+                  <w:pPr>
+                    <w:pStyle w:val="Sinespaciado"/>
+                    <w:jc w:val="center"/>
+                    <w:rPr>
+                      <w:rFonts w:ascii="Times New Roman" w:hAnsi="Times New Roman" w:cs="Times New Roman"/>
+                      <w:b/>
+                      <w:color w:val="FFFFFF"/>
+                      <w:sz w:val="20"/>
+                    </w:rPr>
+                  </w:pPr>
+                  <w:r>
+                    <w:rPr>
+                      <w:rFonts w:ascii="Times New Roman" w:hAnsi="Times New Roman" w:cs="Times New Roman"/>
+                      <w:b/>
+                      <w:color w:val="FFFFFF"/>
+                      <w:sz w:val="20"/>
+                    </w:rPr>
+                    <w:t>A-E</w:t>
+                  </w:r>
+                </w:p>
+              </w:tc>
+              <w:tc>
+                <w:tcPr>
+                  <w:tcW w:w="683" w:type="dxa"/>
+                  <w:shd w:val="clear" w:color="auto" w:fill="538135"/>
+                </w:tcPr>
+                <w:p>
+                  <w:pPr>
+                    <w:pStyle w:val="Sinespaciado"/>
+                    <w:jc w:val="center"/>
+                    <w:rPr>
+                      <w:rFonts w:ascii="Times New Roman" w:hAnsi="Times New Roman" w:cs="Times New Roman"/>
+                      <w:b/>
+                      <w:color w:val="FFFFFF"/>
+                      <w:sz w:val="20"/>
+                    </w:rPr>
+                  </w:pPr>
+                  <w:r>
+                    <w:rPr>
+                      <w:rFonts w:ascii="Times New Roman" w:hAnsi="Times New Roman" w:cs="Times New Roman"/>
+                      <w:b/>
+                      <w:color w:val="FFFFFF"/>
+                      <w:sz w:val="20"/>
+                    </w:rPr>
+                    <w:t>C-M</w:t>
+                  </w:r>
+                </w:p>
+              </w:tc>
+            </w:tr>
+          </w:tbl>
+          <w:p>
+            <w:pPr>
+              <w:spacing w:before="40" w:after="40"/>
+            </w:pPr>
           </w:p>
         </w:tc>
         <w:tc>
@@ -4603,7 +6703,7 @@
                 <w:b/>
                 <w:sz w:val="18"/>
               </w:rPr>
-              <w:t xml:space="preserve">  • Representación: </w:t>
+              <w:t xml:space="preserve">Representación: </w:t>
             </w:r>
             <w:r>
               <w:rPr>
@@ -4623,7 +6723,7 @@
                 <w:b/>
                 <w:sz w:val="18"/>
               </w:rPr>
-              <w:t xml:space="preserve">  • Acción y expresión: </w:t>
+              <w:t xml:space="preserve">Acción y expresión: </w:t>
             </w:r>
             <w:r>
               <w:rPr>
@@ -4643,7 +6743,7 @@
                 <w:b/>
                 <w:sz w:val="18"/>
               </w:rPr>
-              <w:t xml:space="preserve">  • Compromiso-Motivación: </w:t>
+              <w:t xml:space="preserve">Compromiso-Motivación: </w:t>
             </w:r>
             <w:r>
               <w:rPr>
@@ -4653,6 +6753,111 @@
               <w:t>Entusiasmo infantil por el lenguaje dinámico del cómic.</w:t>
             </w:r>
           </w:p>
+          <w:tbl>
+            <w:tblPr>
+              <w:tblStyle w:val="Tablaconcuadrcula"/>
+              <w:tblW w:w="0" w:type="auto"/>
+              <w:jc w:val="center"/>
+              <w:tblLayout w:type="fixed"/>
+            </w:tblPr>
+            <w:tblGrid>
+              <w:gridCol w:w="683"/>
+              <w:gridCol w:w="683"/>
+              <w:gridCol w:w="683"/>
+            </w:tblGrid>
+            <w:tr>
+              <w:trPr>
+                <w:trHeight w:val="278"/>
+                <w:jc w:val="center"/>
+              </w:trPr>
+              <w:tc>
+                <w:tcPr>
+                  <w:tcW w:w="683" w:type="dxa"/>
+                  <w:shd w:val="clear" w:color="auto" w:fill="7030A0"/>
+                </w:tcPr>
+                <w:p>
+                  <w:pPr>
+                    <w:pStyle w:val="Sinespaciado"/>
+                    <w:jc w:val="center"/>
+                    <w:rPr>
+                      <w:rFonts w:ascii="Times New Roman" w:hAnsi="Times New Roman" w:cs="Times New Roman"/>
+                      <w:b/>
+                      <w:color w:val="FFFFFF"/>
+                      <w:sz w:val="20"/>
+                    </w:rPr>
+                  </w:pPr>
+                  <w:r>
+                    <w:rPr>
+                      <w:rFonts w:ascii="Times New Roman" w:hAnsi="Times New Roman" w:cs="Times New Roman"/>
+                      <w:b/>
+                      <w:color w:val="FFFFFF"/>
+                      <w:sz w:val="20"/>
+                    </w:rPr>
+                    <w:t>R</w:t>
+                  </w:r>
+                </w:p>
+              </w:tc>
+              <w:tc>
+                <w:tcPr>
+                  <w:tcW w:w="683" w:type="dxa"/>
+                  <w:shd w:val="clear" w:color="auto" w:fill="00B0F0"/>
+                </w:tcPr>
+                <w:p>
+                  <w:pPr>
+                    <w:pStyle w:val="Sinespaciado"/>
+                    <w:jc w:val="center"/>
+                    <w:rPr>
+                      <w:rFonts w:ascii="Times New Roman" w:hAnsi="Times New Roman" w:cs="Times New Roman"/>
+                      <w:b/>
+                      <w:color w:val="FFFFFF"/>
+                      <w:sz w:val="20"/>
+                    </w:rPr>
+                  </w:pPr>
+                  <w:r>
+                    <w:rPr>
+                      <w:rFonts w:ascii="Times New Roman" w:hAnsi="Times New Roman" w:cs="Times New Roman"/>
+                      <w:b/>
+                      <w:color w:val="FFFFFF"/>
+                      <w:sz w:val="20"/>
+                    </w:rPr>
+                    <w:t>A-E</w:t>
+                  </w:r>
+                </w:p>
+              </w:tc>
+              <w:tc>
+                <w:tcPr>
+                  <w:tcW w:w="683" w:type="dxa"/>
+                  <w:shd w:val="clear" w:color="auto" w:fill="538135"/>
+                </w:tcPr>
+                <w:p>
+                  <w:pPr>
+                    <w:pStyle w:val="Sinespaciado"/>
+                    <w:jc w:val="center"/>
+                    <w:rPr>
+                      <w:rFonts w:ascii="Times New Roman" w:hAnsi="Times New Roman" w:cs="Times New Roman"/>
+                      <w:b/>
+                      <w:color w:val="FFFFFF"/>
+                      <w:sz w:val="20"/>
+                    </w:rPr>
+                  </w:pPr>
+                  <w:r>
+                    <w:rPr>
+                      <w:rFonts w:ascii="Times New Roman" w:hAnsi="Times New Roman" w:cs="Times New Roman"/>
+                      <w:b/>
+                      <w:color w:val="FFFFFF"/>
+                      <w:sz w:val="20"/>
+                    </w:rPr>
+                    <w:t>C-M</w:t>
+                  </w:r>
+                </w:p>
+              </w:tc>
+            </w:tr>
+          </w:tbl>
+          <w:p>
+            <w:pPr>
+              <w:spacing w:before="40" w:after="40"/>
+            </w:pPr>
+          </w:p>
           <w:p>
             <w:pPr>
               <w:spacing w:before="60" w:after="20"/>
@@ -4721,7 +6926,7 @@
                 <w:b/>
                 <w:sz w:val="18"/>
               </w:rPr>
-              <w:t xml:space="preserve">  • Representación: </w:t>
+              <w:t xml:space="preserve">Representación: </w:t>
             </w:r>
             <w:r>
               <w:rPr>
@@ -4741,7 +6946,7 @@
                 <w:b/>
                 <w:sz w:val="18"/>
               </w:rPr>
-              <w:t xml:space="preserve">  • Acción y expresión: </w:t>
+              <w:t xml:space="preserve">Acción y expresión: </w:t>
             </w:r>
             <w:r>
               <w:rPr>
@@ -4761,7 +6966,7 @@
                 <w:b/>
                 <w:sz w:val="18"/>
               </w:rPr>
-              <w:t xml:space="preserve">  • Compromiso-Motivación: </w:t>
+              <w:t xml:space="preserve">Compromiso-Motivación: </w:t>
             </w:r>
             <w:r>
               <w:rPr>
@@ -4771,6 +6976,111 @@
               <w:t>Seguridad y preparación integral para el cierre de la unidad.</w:t>
             </w:r>
           </w:p>
+          <w:tbl>
+            <w:tblPr>
+              <w:tblStyle w:val="Tablaconcuadrcula"/>
+              <w:tblW w:w="0" w:type="auto"/>
+              <w:jc w:val="center"/>
+              <w:tblLayout w:type="fixed"/>
+            </w:tblPr>
+            <w:tblGrid>
+              <w:gridCol w:w="683"/>
+              <w:gridCol w:w="683"/>
+              <w:gridCol w:w="683"/>
+            </w:tblGrid>
+            <w:tr>
+              <w:trPr>
+                <w:trHeight w:val="278"/>
+                <w:jc w:val="center"/>
+              </w:trPr>
+              <w:tc>
+                <w:tcPr>
+                  <w:tcW w:w="683" w:type="dxa"/>
+                  <w:shd w:val="clear" w:color="auto" w:fill="7030A0"/>
+                </w:tcPr>
+                <w:p>
+                  <w:pPr>
+                    <w:pStyle w:val="Sinespaciado"/>
+                    <w:jc w:val="center"/>
+                    <w:rPr>
+                      <w:rFonts w:ascii="Times New Roman" w:hAnsi="Times New Roman" w:cs="Times New Roman"/>
+                      <w:b/>
+                      <w:color w:val="FFFFFF"/>
+                      <w:sz w:val="20"/>
+                    </w:rPr>
+                  </w:pPr>
+                  <w:r>
+                    <w:rPr>
+                      <w:rFonts w:ascii="Times New Roman" w:hAnsi="Times New Roman" w:cs="Times New Roman"/>
+                      <w:b/>
+                      <w:color w:val="FFFFFF"/>
+                      <w:sz w:val="20"/>
+                    </w:rPr>
+                    <w:t>R</w:t>
+                  </w:r>
+                </w:p>
+              </w:tc>
+              <w:tc>
+                <w:tcPr>
+                  <w:tcW w:w="683" w:type="dxa"/>
+                  <w:shd w:val="clear" w:color="auto" w:fill="00B0F0"/>
+                </w:tcPr>
+                <w:p>
+                  <w:pPr>
+                    <w:pStyle w:val="Sinespaciado"/>
+                    <w:jc w:val="center"/>
+                    <w:rPr>
+                      <w:rFonts w:ascii="Times New Roman" w:hAnsi="Times New Roman" w:cs="Times New Roman"/>
+                      <w:b/>
+                      <w:color w:val="FFFFFF"/>
+                      <w:sz w:val="20"/>
+                    </w:rPr>
+                  </w:pPr>
+                  <w:r>
+                    <w:rPr>
+                      <w:rFonts w:ascii="Times New Roman" w:hAnsi="Times New Roman" w:cs="Times New Roman"/>
+                      <w:b/>
+                      <w:color w:val="FFFFFF"/>
+                      <w:sz w:val="20"/>
+                    </w:rPr>
+                    <w:t>A-E</w:t>
+                  </w:r>
+                </w:p>
+              </w:tc>
+              <w:tc>
+                <w:tcPr>
+                  <w:tcW w:w="683" w:type="dxa"/>
+                  <w:shd w:val="clear" w:color="auto" w:fill="538135"/>
+                </w:tcPr>
+                <w:p>
+                  <w:pPr>
+                    <w:pStyle w:val="Sinespaciado"/>
+                    <w:jc w:val="center"/>
+                    <w:rPr>
+                      <w:rFonts w:ascii="Times New Roman" w:hAnsi="Times New Roman" w:cs="Times New Roman"/>
+                      <w:b/>
+                      <w:color w:val="FFFFFF"/>
+                      <w:sz w:val="20"/>
+                    </w:rPr>
+                  </w:pPr>
+                  <w:r>
+                    <w:rPr>
+                      <w:rFonts w:ascii="Times New Roman" w:hAnsi="Times New Roman" w:cs="Times New Roman"/>
+                      <w:b/>
+                      <w:color w:val="FFFFFF"/>
+                      <w:sz w:val="20"/>
+                    </w:rPr>
+                    <w:t>C-M</w:t>
+                  </w:r>
+                </w:p>
+              </w:tc>
+            </w:tr>
+          </w:tbl>
+          <w:p>
+            <w:pPr>
+              <w:spacing w:before="40" w:after="40"/>
+            </w:pPr>
+          </w:p>
           <w:p>
             <w:pPr>
               <w:spacing w:before="60" w:after="20"/>
@@ -4839,7 +7149,7 @@
                 <w:b/>
                 <w:sz w:val="18"/>
               </w:rPr>
-              <w:t xml:space="preserve">  • Representación: </w:t>
+              <w:t xml:space="preserve">Representación: </w:t>
             </w:r>
             <w:r>
               <w:rPr>
@@ -4859,7 +7169,7 @@
                 <w:b/>
                 <w:sz w:val="18"/>
               </w:rPr>
-              <w:t xml:space="preserve">  • Acción y expresión: </w:t>
+              <w:t xml:space="preserve">Acción y expresión: </w:t>
             </w:r>
             <w:r>
               <w:rPr>
@@ -4879,7 +7189,7 @@
                 <w:b/>
                 <w:sz w:val="18"/>
               </w:rPr>
-              <w:t xml:space="preserve">  • Compromiso-Motivación: </w:t>
+              <w:t xml:space="preserve">Compromiso-Motivación: </w:t>
             </w:r>
             <w:r>
               <w:rPr>
@@ -4889,6 +7199,111 @@
               <w:t>Demostración tangible de las competencias adquiridas en el ciclo.</w:t>
             </w:r>
           </w:p>
+          <w:tbl>
+            <w:tblPr>
+              <w:tblStyle w:val="Tablaconcuadrcula"/>
+              <w:tblW w:w="0" w:type="auto"/>
+              <w:jc w:val="center"/>
+              <w:tblLayout w:type="fixed"/>
+            </w:tblPr>
+            <w:tblGrid>
+              <w:gridCol w:w="683"/>
+              <w:gridCol w:w="683"/>
+              <w:gridCol w:w="683"/>
+            </w:tblGrid>
+            <w:tr>
+              <w:trPr>
+                <w:trHeight w:val="278"/>
+                <w:jc w:val="center"/>
+              </w:trPr>
+              <w:tc>
+                <w:tcPr>
+                  <w:tcW w:w="683" w:type="dxa"/>
+                  <w:shd w:val="clear" w:color="auto" w:fill="7030A0"/>
+                </w:tcPr>
+                <w:p>
+                  <w:pPr>
+                    <w:pStyle w:val="Sinespaciado"/>
+                    <w:jc w:val="center"/>
+                    <w:rPr>
+                      <w:rFonts w:ascii="Times New Roman" w:hAnsi="Times New Roman" w:cs="Times New Roman"/>
+                      <w:b/>
+                      <w:color w:val="FFFFFF"/>
+                      <w:sz w:val="20"/>
+                    </w:rPr>
+                  </w:pPr>
+                  <w:r>
+                    <w:rPr>
+                      <w:rFonts w:ascii="Times New Roman" w:hAnsi="Times New Roman" w:cs="Times New Roman"/>
+                      <w:b/>
+                      <w:color w:val="FFFFFF"/>
+                      <w:sz w:val="20"/>
+                    </w:rPr>
+                    <w:t>R</w:t>
+                  </w:r>
+                </w:p>
+              </w:tc>
+              <w:tc>
+                <w:tcPr>
+                  <w:tcW w:w="683" w:type="dxa"/>
+                  <w:shd w:val="clear" w:color="auto" w:fill="00B0F0"/>
+                </w:tcPr>
+                <w:p>
+                  <w:pPr>
+                    <w:pStyle w:val="Sinespaciado"/>
+                    <w:jc w:val="center"/>
+                    <w:rPr>
+                      <w:rFonts w:ascii="Times New Roman" w:hAnsi="Times New Roman" w:cs="Times New Roman"/>
+                      <w:b/>
+                      <w:color w:val="FFFFFF"/>
+                      <w:sz w:val="20"/>
+                    </w:rPr>
+                  </w:pPr>
+                  <w:r>
+                    <w:rPr>
+                      <w:rFonts w:ascii="Times New Roman" w:hAnsi="Times New Roman" w:cs="Times New Roman"/>
+                      <w:b/>
+                      <w:color w:val="FFFFFF"/>
+                      <w:sz w:val="20"/>
+                    </w:rPr>
+                    <w:t>A-E</w:t>
+                  </w:r>
+                </w:p>
+              </w:tc>
+              <w:tc>
+                <w:tcPr>
+                  <w:tcW w:w="683" w:type="dxa"/>
+                  <w:shd w:val="clear" w:color="auto" w:fill="538135"/>
+                </w:tcPr>
+                <w:p>
+                  <w:pPr>
+                    <w:pStyle w:val="Sinespaciado"/>
+                    <w:jc w:val="center"/>
+                    <w:rPr>
+                      <w:rFonts w:ascii="Times New Roman" w:hAnsi="Times New Roman" w:cs="Times New Roman"/>
+                      <w:b/>
+                      <w:color w:val="FFFFFF"/>
+                      <w:sz w:val="20"/>
+                    </w:rPr>
+                  </w:pPr>
+                  <w:r>
+                    <w:rPr>
+                      <w:rFonts w:ascii="Times New Roman" w:hAnsi="Times New Roman" w:cs="Times New Roman"/>
+                      <w:b/>
+                      <w:color w:val="FFFFFF"/>
+                      <w:sz w:val="20"/>
+                    </w:rPr>
+                    <w:t>C-M</w:t>
+                  </w:r>
+                </w:p>
+              </w:tc>
+            </w:tr>
+          </w:tbl>
+          <w:p>
+            <w:pPr>
+              <w:spacing w:before="40" w:after="40"/>
+            </w:pPr>
+          </w:p>
           <w:p>
             <w:pPr>
               <w:spacing w:before="60" w:after="20"/>
@@ -4957,7 +7372,7 @@
                 <w:b/>
                 <w:sz w:val="18"/>
               </w:rPr>
-              <w:t xml:space="preserve">  • Representación: </w:t>
+              <w:t xml:space="preserve">Representación: </w:t>
             </w:r>
             <w:r>
               <w:rPr>
@@ -4977,7 +7392,7 @@
                 <w:b/>
                 <w:sz w:val="18"/>
               </w:rPr>
-              <w:t xml:space="preserve">  • Acción y expresión: </w:t>
+              <w:t xml:space="preserve">Acción y expresión: </w:t>
             </w:r>
             <w:r>
               <w:rPr>
@@ -4997,7 +7412,7 @@
                 <w:b/>
                 <w:sz w:val="18"/>
               </w:rPr>
-              <w:t xml:space="preserve">  • Compromiso-Motivación: </w:t>
+              <w:t xml:space="preserve">Compromiso-Motivación: </w:t>
             </w:r>
             <w:r>
               <w:rPr>
@@ -5006,6 +7421,111 @@
               </w:rPr>
               <w:t>Culminación exitosa y satisfacción por el producto final terminado.</w:t>
             </w:r>
+          </w:p>
+          <w:tbl>
+            <w:tblPr>
+              <w:tblStyle w:val="Tablaconcuadrcula"/>
+              <w:tblW w:w="0" w:type="auto"/>
+              <w:jc w:val="center"/>
+              <w:tblLayout w:type="fixed"/>
+            </w:tblPr>
+            <w:tblGrid>
+              <w:gridCol w:w="683"/>
+              <w:gridCol w:w="683"/>
+              <w:gridCol w:w="683"/>
+            </w:tblGrid>
+            <w:tr>
+              <w:trPr>
+                <w:trHeight w:val="278"/>
+                <w:jc w:val="center"/>
+              </w:trPr>
+              <w:tc>
+                <w:tcPr>
+                  <w:tcW w:w="683" w:type="dxa"/>
+                  <w:shd w:val="clear" w:color="auto" w:fill="7030A0"/>
+                </w:tcPr>
+                <w:p>
+                  <w:pPr>
+                    <w:pStyle w:val="Sinespaciado"/>
+                    <w:jc w:val="center"/>
+                    <w:rPr>
+                      <w:rFonts w:ascii="Times New Roman" w:hAnsi="Times New Roman" w:cs="Times New Roman"/>
+                      <w:b/>
+                      <w:color w:val="FFFFFF"/>
+                      <w:sz w:val="20"/>
+                    </w:rPr>
+                  </w:pPr>
+                  <w:r>
+                    <w:rPr>
+                      <w:rFonts w:ascii="Times New Roman" w:hAnsi="Times New Roman" w:cs="Times New Roman"/>
+                      <w:b/>
+                      <w:color w:val="FFFFFF"/>
+                      <w:sz w:val="20"/>
+                    </w:rPr>
+                    <w:t>R</w:t>
+                  </w:r>
+                </w:p>
+              </w:tc>
+              <w:tc>
+                <w:tcPr>
+                  <w:tcW w:w="683" w:type="dxa"/>
+                  <w:shd w:val="clear" w:color="auto" w:fill="00B0F0"/>
+                </w:tcPr>
+                <w:p>
+                  <w:pPr>
+                    <w:pStyle w:val="Sinespaciado"/>
+                    <w:jc w:val="center"/>
+                    <w:rPr>
+                      <w:rFonts w:ascii="Times New Roman" w:hAnsi="Times New Roman" w:cs="Times New Roman"/>
+                      <w:b/>
+                      <w:color w:val="FFFFFF"/>
+                      <w:sz w:val="20"/>
+                    </w:rPr>
+                  </w:pPr>
+                  <w:r>
+                    <w:rPr>
+                      <w:rFonts w:ascii="Times New Roman" w:hAnsi="Times New Roman" w:cs="Times New Roman"/>
+                      <w:b/>
+                      <w:color w:val="FFFFFF"/>
+                      <w:sz w:val="20"/>
+                    </w:rPr>
+                    <w:t>A-E</w:t>
+                  </w:r>
+                </w:p>
+              </w:tc>
+              <w:tc>
+                <w:tcPr>
+                  <w:tcW w:w="683" w:type="dxa"/>
+                  <w:shd w:val="clear" w:color="auto" w:fill="538135"/>
+                </w:tcPr>
+                <w:p>
+                  <w:pPr>
+                    <w:pStyle w:val="Sinespaciado"/>
+                    <w:jc w:val="center"/>
+                    <w:rPr>
+                      <w:rFonts w:ascii="Times New Roman" w:hAnsi="Times New Roman" w:cs="Times New Roman"/>
+                      <w:b/>
+                      <w:color w:val="FFFFFF"/>
+                      <w:sz w:val="20"/>
+                    </w:rPr>
+                  </w:pPr>
+                  <w:r>
+                    <w:rPr>
+                      <w:rFonts w:ascii="Times New Roman" w:hAnsi="Times New Roman" w:cs="Times New Roman"/>
+                      <w:b/>
+                      <w:color w:val="FFFFFF"/>
+                      <w:sz w:val="20"/>
+                    </w:rPr>
+                    <w:t>C-M</w:t>
+                  </w:r>
+                </w:p>
+              </w:tc>
+            </w:tr>
+          </w:tbl>
+          <w:p>
+            <w:pPr>
+              <w:spacing w:before="40" w:after="40"/>
+            </w:pPr>
           </w:p>
         </w:tc>
         <w:tc>
@@ -5198,7 +7718,7 @@
                 <w:b/>
                 <w:sz w:val="18"/>
               </w:rPr>
-              <w:t xml:space="preserve">  • Representación: </w:t>
+              <w:t xml:space="preserve">Representación: </w:t>
             </w:r>
             <w:r>
               <w:rPr>
@@ -5218,7 +7738,7 @@
                 <w:b/>
                 <w:sz w:val="18"/>
               </w:rPr>
-              <w:t xml:space="preserve">  • Acción y expresión: </w:t>
+              <w:t xml:space="preserve">Acción y expresión: </w:t>
             </w:r>
             <w:r>
               <w:rPr>
@@ -5238,7 +7758,7 @@
                 <w:b/>
                 <w:sz w:val="18"/>
               </w:rPr>
-              <w:t xml:space="preserve">  • Compromiso-Motivación: </w:t>
+              <w:t xml:space="preserve">Compromiso-Motivación: </w:t>
             </w:r>
             <w:r>
               <w:rPr>
@@ -5248,6 +7768,111 @@
               <w:t>Entusiasmo por visibilizar el producto elaborado durante el trimestre.</w:t>
             </w:r>
           </w:p>
+          <w:tbl>
+            <w:tblPr>
+              <w:tblStyle w:val="Tablaconcuadrcula"/>
+              <w:tblW w:w="0" w:type="auto"/>
+              <w:jc w:val="center"/>
+              <w:tblLayout w:type="fixed"/>
+            </w:tblPr>
+            <w:tblGrid>
+              <w:gridCol w:w="683"/>
+              <w:gridCol w:w="683"/>
+              <w:gridCol w:w="683"/>
+            </w:tblGrid>
+            <w:tr>
+              <w:trPr>
+                <w:trHeight w:val="278"/>
+                <w:jc w:val="center"/>
+              </w:trPr>
+              <w:tc>
+                <w:tcPr>
+                  <w:tcW w:w="683" w:type="dxa"/>
+                  <w:shd w:val="clear" w:color="auto" w:fill="7030A0"/>
+                </w:tcPr>
+                <w:p>
+                  <w:pPr>
+                    <w:pStyle w:val="Sinespaciado"/>
+                    <w:jc w:val="center"/>
+                    <w:rPr>
+                      <w:rFonts w:ascii="Times New Roman" w:hAnsi="Times New Roman" w:cs="Times New Roman"/>
+                      <w:b/>
+                      <w:color w:val="FFFFFF"/>
+                      <w:sz w:val="20"/>
+                    </w:rPr>
+                  </w:pPr>
+                  <w:r>
+                    <w:rPr>
+                      <w:rFonts w:ascii="Times New Roman" w:hAnsi="Times New Roman" w:cs="Times New Roman"/>
+                      <w:b/>
+                      <w:color w:val="FFFFFF"/>
+                      <w:sz w:val="20"/>
+                    </w:rPr>
+                    <w:t>R</w:t>
+                  </w:r>
+                </w:p>
+              </w:tc>
+              <w:tc>
+                <w:tcPr>
+                  <w:tcW w:w="683" w:type="dxa"/>
+                  <w:shd w:val="clear" w:color="auto" w:fill="00B0F0"/>
+                </w:tcPr>
+                <w:p>
+                  <w:pPr>
+                    <w:pStyle w:val="Sinespaciado"/>
+                    <w:jc w:val="center"/>
+                    <w:rPr>
+                      <w:rFonts w:ascii="Times New Roman" w:hAnsi="Times New Roman" w:cs="Times New Roman"/>
+                      <w:b/>
+                      <w:color w:val="FFFFFF"/>
+                      <w:sz w:val="20"/>
+                    </w:rPr>
+                  </w:pPr>
+                  <w:r>
+                    <w:rPr>
+                      <w:rFonts w:ascii="Times New Roman" w:hAnsi="Times New Roman" w:cs="Times New Roman"/>
+                      <w:b/>
+                      <w:color w:val="FFFFFF"/>
+                      <w:sz w:val="20"/>
+                    </w:rPr>
+                    <w:t>A-E</w:t>
+                  </w:r>
+                </w:p>
+              </w:tc>
+              <w:tc>
+                <w:tcPr>
+                  <w:tcW w:w="683" w:type="dxa"/>
+                  <w:shd w:val="clear" w:color="auto" w:fill="538135"/>
+                </w:tcPr>
+                <w:p>
+                  <w:pPr>
+                    <w:pStyle w:val="Sinespaciado"/>
+                    <w:jc w:val="center"/>
+                    <w:rPr>
+                      <w:rFonts w:ascii="Times New Roman" w:hAnsi="Times New Roman" w:cs="Times New Roman"/>
+                      <w:b/>
+                      <w:color w:val="FFFFFF"/>
+                      <w:sz w:val="20"/>
+                    </w:rPr>
+                  </w:pPr>
+                  <w:r>
+                    <w:rPr>
+                      <w:rFonts w:ascii="Times New Roman" w:hAnsi="Times New Roman" w:cs="Times New Roman"/>
+                      <w:b/>
+                      <w:color w:val="FFFFFF"/>
+                      <w:sz w:val="20"/>
+                    </w:rPr>
+                    <w:t>C-M</w:t>
+                  </w:r>
+                </w:p>
+              </w:tc>
+            </w:tr>
+          </w:tbl>
+          <w:p>
+            <w:pPr>
+              <w:spacing w:before="40" w:after="40"/>
+            </w:pPr>
+          </w:p>
           <w:p>
             <w:pPr>
               <w:spacing w:before="60" w:after="20"/>
@@ -5316,7 +7941,7 @@
                 <w:b/>
                 <w:sz w:val="18"/>
               </w:rPr>
-              <w:t xml:space="preserve">  • Representación: </w:t>
+              <w:t xml:space="preserve">Representación: </w:t>
             </w:r>
             <w:r>
               <w:rPr>
@@ -5336,7 +7961,7 @@
                 <w:b/>
                 <w:sz w:val="18"/>
               </w:rPr>
-              <w:t xml:space="preserve">  • Acción y expresión: </w:t>
+              <w:t xml:space="preserve">Acción y expresión: </w:t>
             </w:r>
             <w:r>
               <w:rPr>
@@ -5356,7 +7981,7 @@
                 <w:b/>
                 <w:sz w:val="18"/>
               </w:rPr>
-              <w:t xml:space="preserve">  • Compromiso-Motivación: </w:t>
+              <w:t xml:space="preserve">Compromiso-Motivación: </w:t>
             </w:r>
             <w:r>
               <w:rPr>
@@ -5366,6 +7991,111 @@
               <w:t>Cultura de automejora y responsabilidad compartida.</w:t>
             </w:r>
           </w:p>
+          <w:tbl>
+            <w:tblPr>
+              <w:tblStyle w:val="Tablaconcuadrcula"/>
+              <w:tblW w:w="0" w:type="auto"/>
+              <w:jc w:val="center"/>
+              <w:tblLayout w:type="fixed"/>
+            </w:tblPr>
+            <w:tblGrid>
+              <w:gridCol w:w="683"/>
+              <w:gridCol w:w="683"/>
+              <w:gridCol w:w="683"/>
+            </w:tblGrid>
+            <w:tr>
+              <w:trPr>
+                <w:trHeight w:val="278"/>
+                <w:jc w:val="center"/>
+              </w:trPr>
+              <w:tc>
+                <w:tcPr>
+                  <w:tcW w:w="683" w:type="dxa"/>
+                  <w:shd w:val="clear" w:color="auto" w:fill="7030A0"/>
+                </w:tcPr>
+                <w:p>
+                  <w:pPr>
+                    <w:pStyle w:val="Sinespaciado"/>
+                    <w:jc w:val="center"/>
+                    <w:rPr>
+                      <w:rFonts w:ascii="Times New Roman" w:hAnsi="Times New Roman" w:cs="Times New Roman"/>
+                      <w:b/>
+                      <w:color w:val="FFFFFF"/>
+                      <w:sz w:val="20"/>
+                    </w:rPr>
+                  </w:pPr>
+                  <w:r>
+                    <w:rPr>
+                      <w:rFonts w:ascii="Times New Roman" w:hAnsi="Times New Roman" w:cs="Times New Roman"/>
+                      <w:b/>
+                      <w:color w:val="FFFFFF"/>
+                      <w:sz w:val="20"/>
+                    </w:rPr>
+                    <w:t>R</w:t>
+                  </w:r>
+                </w:p>
+              </w:tc>
+              <w:tc>
+                <w:tcPr>
+                  <w:tcW w:w="683" w:type="dxa"/>
+                  <w:shd w:val="clear" w:color="auto" w:fill="00B0F0"/>
+                </w:tcPr>
+                <w:p>
+                  <w:pPr>
+                    <w:pStyle w:val="Sinespaciado"/>
+                    <w:jc w:val="center"/>
+                    <w:rPr>
+                      <w:rFonts w:ascii="Times New Roman" w:hAnsi="Times New Roman" w:cs="Times New Roman"/>
+                      <w:b/>
+                      <w:color w:val="FFFFFF"/>
+                      <w:sz w:val="20"/>
+                    </w:rPr>
+                  </w:pPr>
+                  <w:r>
+                    <w:rPr>
+                      <w:rFonts w:ascii="Times New Roman" w:hAnsi="Times New Roman" w:cs="Times New Roman"/>
+                      <w:b/>
+                      <w:color w:val="FFFFFF"/>
+                      <w:sz w:val="20"/>
+                    </w:rPr>
+                    <w:t>A-E</w:t>
+                  </w:r>
+                </w:p>
+              </w:tc>
+              <w:tc>
+                <w:tcPr>
+                  <w:tcW w:w="683" w:type="dxa"/>
+                  <w:shd w:val="clear" w:color="auto" w:fill="538135"/>
+                </w:tcPr>
+                <w:p>
+                  <w:pPr>
+                    <w:pStyle w:val="Sinespaciado"/>
+                    <w:jc w:val="center"/>
+                    <w:rPr>
+                      <w:rFonts w:ascii="Times New Roman" w:hAnsi="Times New Roman" w:cs="Times New Roman"/>
+                      <w:b/>
+                      <w:color w:val="FFFFFF"/>
+                      <w:sz w:val="20"/>
+                    </w:rPr>
+                  </w:pPr>
+                  <w:r>
+                    <w:rPr>
+                      <w:rFonts w:ascii="Times New Roman" w:hAnsi="Times New Roman" w:cs="Times New Roman"/>
+                      <w:b/>
+                      <w:color w:val="FFFFFF"/>
+                      <w:sz w:val="20"/>
+                    </w:rPr>
+                    <w:t>C-M</w:t>
+                  </w:r>
+                </w:p>
+              </w:tc>
+            </w:tr>
+          </w:tbl>
+          <w:p>
+            <w:pPr>
+              <w:spacing w:before="40" w:after="40"/>
+            </w:pPr>
+          </w:p>
           <w:p>
             <w:pPr>
               <w:spacing w:before="60" w:after="20"/>
@@ -5434,7 +8164,7 @@
                 <w:b/>
                 <w:sz w:val="18"/>
               </w:rPr>
-              <w:t xml:space="preserve">  • Representación: </w:t>
+              <w:t xml:space="preserve">Representación: </w:t>
             </w:r>
             <w:r>
               <w:rPr>
@@ -5454,7 +8184,7 @@
                 <w:b/>
                 <w:sz w:val="18"/>
               </w:rPr>
-              <w:t xml:space="preserve">  • Acción y expresión: </w:t>
+              <w:t xml:space="preserve">Acción y expresión: </w:t>
             </w:r>
             <w:r>
               <w:rPr>
@@ -5474,7 +8204,7 @@
                 <w:b/>
                 <w:sz w:val="18"/>
               </w:rPr>
-              <w:t xml:space="preserve">  • Compromiso-Motivación: </w:t>
+              <w:t xml:space="preserve">Compromiso-Motivación: </w:t>
             </w:r>
             <w:r>
               <w:rPr>
@@ -5484,6 +8214,111 @@
               <w:t>Reconocimiento público del esfuerzo colectivo y aprendizaje colaborativo.</w:t>
             </w:r>
           </w:p>
+          <w:tbl>
+            <w:tblPr>
+              <w:tblStyle w:val="Tablaconcuadrcula"/>
+              <w:tblW w:w="0" w:type="auto"/>
+              <w:jc w:val="center"/>
+              <w:tblLayout w:type="fixed"/>
+            </w:tblPr>
+            <w:tblGrid>
+              <w:gridCol w:w="683"/>
+              <w:gridCol w:w="683"/>
+              <w:gridCol w:w="683"/>
+            </w:tblGrid>
+            <w:tr>
+              <w:trPr>
+                <w:trHeight w:val="278"/>
+                <w:jc w:val="center"/>
+              </w:trPr>
+              <w:tc>
+                <w:tcPr>
+                  <w:tcW w:w="683" w:type="dxa"/>
+                  <w:shd w:val="clear" w:color="auto" w:fill="7030A0"/>
+                </w:tcPr>
+                <w:p>
+                  <w:pPr>
+                    <w:pStyle w:val="Sinespaciado"/>
+                    <w:jc w:val="center"/>
+                    <w:rPr>
+                      <w:rFonts w:ascii="Times New Roman" w:hAnsi="Times New Roman" w:cs="Times New Roman"/>
+                      <w:b/>
+                      <w:color w:val="FFFFFF"/>
+                      <w:sz w:val="20"/>
+                    </w:rPr>
+                  </w:pPr>
+                  <w:r>
+                    <w:rPr>
+                      <w:rFonts w:ascii="Times New Roman" w:hAnsi="Times New Roman" w:cs="Times New Roman"/>
+                      <w:b/>
+                      <w:color w:val="FFFFFF"/>
+                      <w:sz w:val="20"/>
+                    </w:rPr>
+                    <w:t>R</w:t>
+                  </w:r>
+                </w:p>
+              </w:tc>
+              <w:tc>
+                <w:tcPr>
+                  <w:tcW w:w="683" w:type="dxa"/>
+                  <w:shd w:val="clear" w:color="auto" w:fill="00B0F0"/>
+                </w:tcPr>
+                <w:p>
+                  <w:pPr>
+                    <w:pStyle w:val="Sinespaciado"/>
+                    <w:jc w:val="center"/>
+                    <w:rPr>
+                      <w:rFonts w:ascii="Times New Roman" w:hAnsi="Times New Roman" w:cs="Times New Roman"/>
+                      <w:b/>
+                      <w:color w:val="FFFFFF"/>
+                      <w:sz w:val="20"/>
+                    </w:rPr>
+                  </w:pPr>
+                  <w:r>
+                    <w:rPr>
+                      <w:rFonts w:ascii="Times New Roman" w:hAnsi="Times New Roman" w:cs="Times New Roman"/>
+                      <w:b/>
+                      <w:color w:val="FFFFFF"/>
+                      <w:sz w:val="20"/>
+                    </w:rPr>
+                    <w:t>A-E</w:t>
+                  </w:r>
+                </w:p>
+              </w:tc>
+              <w:tc>
+                <w:tcPr>
+                  <w:tcW w:w="683" w:type="dxa"/>
+                  <w:shd w:val="clear" w:color="auto" w:fill="538135"/>
+                </w:tcPr>
+                <w:p>
+                  <w:pPr>
+                    <w:pStyle w:val="Sinespaciado"/>
+                    <w:jc w:val="center"/>
+                    <w:rPr>
+                      <w:rFonts w:ascii="Times New Roman" w:hAnsi="Times New Roman" w:cs="Times New Roman"/>
+                      <w:b/>
+                      <w:color w:val="FFFFFF"/>
+                      <w:sz w:val="20"/>
+                    </w:rPr>
+                  </w:pPr>
+                  <w:r>
+                    <w:rPr>
+                      <w:rFonts w:ascii="Times New Roman" w:hAnsi="Times New Roman" w:cs="Times New Roman"/>
+                      <w:b/>
+                      <w:color w:val="FFFFFF"/>
+                      <w:sz w:val="20"/>
+                    </w:rPr>
+                    <w:t>C-M</w:t>
+                  </w:r>
+                </w:p>
+              </w:tc>
+            </w:tr>
+          </w:tbl>
+          <w:p>
+            <w:pPr>
+              <w:spacing w:before="40" w:after="40"/>
+            </w:pPr>
+          </w:p>
           <w:p>
             <w:pPr>
               <w:spacing w:before="60" w:after="20"/>
@@ -5552,7 +8387,7 @@
                 <w:b/>
                 <w:sz w:val="18"/>
               </w:rPr>
-              <w:t xml:space="preserve">  • Representación: </w:t>
+              <w:t xml:space="preserve">Representación: </w:t>
             </w:r>
             <w:r>
               <w:rPr>
@@ -5572,7 +8407,7 @@
                 <w:b/>
                 <w:sz w:val="18"/>
               </w:rPr>
-              <w:t xml:space="preserve">  • Acción y expresión: </w:t>
+              <w:t xml:space="preserve">Acción y expresión: </w:t>
             </w:r>
             <w:r>
               <w:rPr>
@@ -5592,7 +8427,7 @@
                 <w:b/>
                 <w:sz w:val="18"/>
               </w:rPr>
-              <w:t xml:space="preserve">  • Compromiso-Motivación: </w:t>
+              <w:t xml:space="preserve">Compromiso-Motivación: </w:t>
             </w:r>
             <w:r>
               <w:rPr>
@@ -5601,6 +8436,111 @@
               </w:rPr>
               <w:t>Coronación exitosa del Proyecto Integrador del Primer Trimestre.</w:t>
             </w:r>
+          </w:p>
+          <w:tbl>
+            <w:tblPr>
+              <w:tblStyle w:val="Tablaconcuadrcula"/>
+              <w:tblW w:w="0" w:type="auto"/>
+              <w:jc w:val="center"/>
+              <w:tblLayout w:type="fixed"/>
+            </w:tblPr>
+            <w:tblGrid>
+              <w:gridCol w:w="683"/>
+              <w:gridCol w:w="683"/>
+              <w:gridCol w:w="683"/>
+            </w:tblGrid>
+            <w:tr>
+              <w:trPr>
+                <w:trHeight w:val="278"/>
+                <w:jc w:val="center"/>
+              </w:trPr>
+              <w:tc>
+                <w:tcPr>
+                  <w:tcW w:w="683" w:type="dxa"/>
+                  <w:shd w:val="clear" w:color="auto" w:fill="7030A0"/>
+                </w:tcPr>
+                <w:p>
+                  <w:pPr>
+                    <w:pStyle w:val="Sinespaciado"/>
+                    <w:jc w:val="center"/>
+                    <w:rPr>
+                      <w:rFonts w:ascii="Times New Roman" w:hAnsi="Times New Roman" w:cs="Times New Roman"/>
+                      <w:b/>
+                      <w:color w:val="FFFFFF"/>
+                      <w:sz w:val="20"/>
+                    </w:rPr>
+                  </w:pPr>
+                  <w:r>
+                    <w:rPr>
+                      <w:rFonts w:ascii="Times New Roman" w:hAnsi="Times New Roman" w:cs="Times New Roman"/>
+                      <w:b/>
+                      <w:color w:val="FFFFFF"/>
+                      <w:sz w:val="20"/>
+                    </w:rPr>
+                    <w:t>R</w:t>
+                  </w:r>
+                </w:p>
+              </w:tc>
+              <w:tc>
+                <w:tcPr>
+                  <w:tcW w:w="683" w:type="dxa"/>
+                  <w:shd w:val="clear" w:color="auto" w:fill="00B0F0"/>
+                </w:tcPr>
+                <w:p>
+                  <w:pPr>
+                    <w:pStyle w:val="Sinespaciado"/>
+                    <w:jc w:val="center"/>
+                    <w:rPr>
+                      <w:rFonts w:ascii="Times New Roman" w:hAnsi="Times New Roman" w:cs="Times New Roman"/>
+                      <w:b/>
+                      <w:color w:val="FFFFFF"/>
+                      <w:sz w:val="20"/>
+                    </w:rPr>
+                  </w:pPr>
+                  <w:r>
+                    <w:rPr>
+                      <w:rFonts w:ascii="Times New Roman" w:hAnsi="Times New Roman" w:cs="Times New Roman"/>
+                      <w:b/>
+                      <w:color w:val="FFFFFF"/>
+                      <w:sz w:val="20"/>
+                    </w:rPr>
+                    <w:t>A-E</w:t>
+                  </w:r>
+                </w:p>
+              </w:tc>
+              <w:tc>
+                <w:tcPr>
+                  <w:tcW w:w="683" w:type="dxa"/>
+                  <w:shd w:val="clear" w:color="auto" w:fill="538135"/>
+                </w:tcPr>
+                <w:p>
+                  <w:pPr>
+                    <w:pStyle w:val="Sinespaciado"/>
+                    <w:jc w:val="center"/>
+                    <w:rPr>
+                      <w:rFonts w:ascii="Times New Roman" w:hAnsi="Times New Roman" w:cs="Times New Roman"/>
+                      <w:b/>
+                      <w:color w:val="FFFFFF"/>
+                      <w:sz w:val="20"/>
+                    </w:rPr>
+                  </w:pPr>
+                  <w:r>
+                    <w:rPr>
+                      <w:rFonts w:ascii="Times New Roman" w:hAnsi="Times New Roman" w:cs="Times New Roman"/>
+                      <w:b/>
+                      <w:color w:val="FFFFFF"/>
+                      <w:sz w:val="20"/>
+                    </w:rPr>
+                    <w:t>C-M</w:t>
+                  </w:r>
+                </w:p>
+              </w:tc>
+            </w:tr>
+          </w:tbl>
+          <w:p>
+            <w:pPr>
+              <w:spacing w:before="40" w:after="40"/>
+            </w:pPr>
           </w:p>
         </w:tc>
         <w:tc>

</xml_diff>